<commit_message>
İlerleme notuna "buradan başla" satırı ekle
Notu açan kişi öncelik listesini okumadan da bir sonraki somut hamleyi
görsün: Say ve Eşleştir, hangi parçaların hazır olduğu ve yeni olanın ne
olduğu.

Co-Authored-By: Claude Opus 5 <noreply@anthropic.com>
Claude-Session: https://claude.ai/code/session_011Y16jrDVLkiRskmm4hr2AX
</commit_message>
<xml_diff>
--- a/ilerleme notu.docx
+++ b/ilerleme notu.docx
@@ -76,6 +76,50 @@
           <w:color w:val="3A2A1E"/>
         </w:rPr>
         <w:t xml:space="preserve"> 130 test geçiyor · 10 oyun tanımlı, 5'i oynanabilir (Eşleştirme Kartları, Balon Patlatma, Şekil Ayırma, Harf Avı, Sayı Avı).</w:t>
+      </w:r>
+    </w:p>
+    <w:p>
+      <w:pPr/>
+      <w:r>
+        <w:rPr>
+          <w:b/>
+          <w:color w:val="3A2A1E"/>
+        </w:rPr>
+        <w:t>Buradan başla:</w:t>
+      </w:r>
+      <w:r>
+        <w:rPr>
+          <w:color w:val="3A2A1E"/>
+        </w:rPr>
+        <w:t xml:space="preserve"> Say ve Eşleştir. Parçaları hazır — </w:t>
+      </w:r>
+      <w:r>
+        <w:rPr>
+          <w:rFonts w:ascii="Consolas" w:hAnsi="Consolas"/>
+          <w:color w:val="3A2A1E"/>
+          <w:sz w:val="20"/>
+        </w:rPr>
+        <w:t>GlyphTileView</w:t>
+      </w:r>
+      <w:r>
+        <w:rPr>
+          <w:color w:val="3A2A1E"/>
+        </w:rPr>
+        <w:t xml:space="preserve"> sayı kutucuğunu, </w:t>
+      </w:r>
+      <w:r>
+        <w:rPr>
+          <w:rFonts w:ascii="Consolas" w:hAnsi="Consolas"/>
+          <w:color w:val="3A2A1E"/>
+          <w:sz w:val="20"/>
+        </w:rPr>
+        <w:t>ShapeSortSurface</w:t>
+      </w:r>
+      <w:r>
+        <w:rPr>
+          <w:color w:val="3A2A1E"/>
+        </w:rPr>
+        <w:t xml:space="preserve"> sürükleme kalıbını veriyor. Yeni olan tek şey "miktar" tarafı: ekranda n tane nesne gösterilip doğru rakama sürüklenecek. Adımlar için 8. bölüme bak.</w:t>
       </w:r>
     </w:p>
     <w:p>

</xml_diff>

<commit_message>
Say ve Eşleştir'i ekle
Öğretici bölümün son oyunu: ekranda bir nesne kümesi duruyor, çocuk kümeyi
doğru rakamın üstüne sürüklüyor. Sayı Avı rakamı tanımayı öğretiyordu, bu
oyun rakamı bir miktara bağlıyor.

Banda göre üç knob: miktar aralığı (1-3 / 1-5 / 1-10), çeldirici rakamların
uzaklığı (Meşe'de komşu sayılar, yani tahmin değil gerçekten sayma) ve
nesnelerin dizilişi (Meşe'de dağınık, altında beşerli sıra).

Sürükleme Şekil Ayırma'daki kalıbın aynısı; sürüklenen şey tek nesne değil
kümenin tamamı olduğu için nesneler bir kartın üstünde duruyor.

Co-Authored-By: Claude Opus 5 <noreply@anthropic.com>
</commit_message>
<xml_diff>
--- a/ilerleme notu.docx
+++ b/ilerleme notu.docx
@@ -17,7 +17,7 @@
           <w:color w:val="7A6A5C"/>
           <w:sz w:val="18"/>
         </w:rPr>
-        <w:t>Son güncelleme: 24.08.2026</w:t>
+        <w:t>Son güncelleme: 26.08.2026</w:t>
       </w:r>
     </w:p>
     <w:p>
@@ -43,7 +43,7 @@
         <w:rPr>
           <w:color w:val="3A2A1E"/>
         </w:rPr>
-        <w:t>Faz 1 tamamlandı, Faz 2 yarılandı. Uygulama Android tablette uçtan uca çalışıyor: çocuk profili oluşturuluyor, oyun seçiliyor, oynanıyor, yıldız kazanılıyor ve kayıt cihazda tutuluyor. Beş mini oyun oynanabilir durumda, kalan beşi katalogda "yakında" olarak görünüyor.</w:t>
+        <w:t>Faz 1 tamamlandı, Faz 2'nin öğretici tarafı bitti. Uygulama Android tablette uçtan uca çalışıyor: çocuk profili oluşturuluyor, oyun seçiliyor, oynanıyor, yıldız kazanılıyor ve kayıt cihazda tutuluyor. Altı mini oyun oynanabilir durumda, kalan dördü katalogda "yakında" olarak görünüyor.</w:t>
       </w:r>
     </w:p>
     <w:p>
@@ -59,7 +59,29 @@
         <w:rPr>
           <w:color w:val="3A2A1E"/>
         </w:rPr>
-        <w:t xml:space="preserve"> Harf Avı ve Sayı Avı eklendi. İkisi aynı mekaniği paylaşıyor, tek sayfa ve tek görünüm modeli kullanıyor; hangisi olduğu oturumdaki oyun kimliğinden çözülüyor.</w:t>
+        <w:t xml:space="preserve"> Say ve Eşleştir eklendi — üç öğretici oyunun sonuncusu, yani öğretici bölüm artık tam. Ekranda bir nesne kümesi duruyor, çocuk kümeyi doğru rakamın üstüne sürüklüyor. Sayı Avı "rakamı tanıma"yı öğretiyordu; bu oyun rakamı bir </w:t>
+      </w:r>
+      <w:r>
+        <w:rPr>
+          <w:b/>
+          <w:color w:val="3A2A1E"/>
+        </w:rPr>
+        <w:t>miktara</w:t>
+      </w:r>
+      <w:r>
+        <w:rPr>
+          <w:color w:val="3A2A1E"/>
+        </w:rPr>
+        <w:t xml:space="preserve"> bağlıyor, yani bir sonraki adım.</w:t>
+      </w:r>
+    </w:p>
+    <w:p>
+      <w:pPr/>
+      <w:r>
+        <w:rPr>
+          <w:color w:val="3A2A1E"/>
+        </w:rPr>
+        <w:t>Oyunun banda göre üç ayrı zorluk knob'u var: miktar aralığı (Filiz 1-3, Fidan 1-5, Meşe 1-10), çeldirici rakamların uzaklığı (Meşe'de komşu sayılar — 6 ile 7 arasından seçmek gerçekten saymayı gerektiriyor) ve nesnelerin dizilişi (Meşe'de dağınık, altındaki bantlarda beşerli sıra). Beşerli diziliş bilinçli: 7 nesne "bir tam sıra ve iki tane" olarak görünüyor.</w:t>
       </w:r>
     </w:p>
     <w:p>
@@ -75,7 +97,7 @@
         <w:rPr>
           <w:color w:val="3A2A1E"/>
         </w:rPr>
-        <w:t xml:space="preserve"> 130 test geçiyor · 10 oyun tanımlı, 5'i oynanabilir (Eşleştirme Kartları, Balon Patlatma, Şekil Ayırma, Harf Avı, Sayı Avı).</w:t>
+        <w:t xml:space="preserve"> 150 test geçiyor · 10 oyun tanımlı, 6'sı oynanabilir (Eşleştirme Kartları, Balon Patlatma, Şekil Ayırma, Harf Avı, Sayı Avı, Say ve Eşleştir).</w:t>
       </w:r>
     </w:p>
     <w:p>
@@ -91,7 +113,7 @@
         <w:rPr>
           <w:color w:val="3A2A1E"/>
         </w:rPr>
-        <w:t xml:space="preserve"> Say ve Eşleştir. Parçaları hazır — </w:t>
+        <w:t xml:space="preserve"> Sırayı Tekrarla. Kalan dört oyunun en az riskli olanı ve tek yeni parçası bir zamanlayıcı kalıbı: ekran bir diziyi kendi oynatacak (ışık yanar, ses çalar, sırayla), sonra çocuğun tekrarlamasını bekleyecek. Şu ana kadarki bütün oyunlar "çocuk dokunur, ekran cevap verir" kalıbındaydı; bu ilk kez tersi. Yerleşim MAUI kontrolleriyle yapılabilir (canvas gerekmiyor), </w:t>
       </w:r>
       <w:r>
         <w:rPr>
@@ -105,21 +127,23 @@
         <w:rPr>
           <w:color w:val="3A2A1E"/>
         </w:rPr>
-        <w:t xml:space="preserve"> sayı kutucuğunu, </w:t>
+        <w:t>'un doğru/yanlış geri bildirimi olduğu gibi kullanılabilir. Adımlar için 8. bölüme bak.</w:t>
       </w:r>
+    </w:p>
+    <w:p>
+      <w:pPr/>
       <w:r>
         <w:rPr>
-          <w:rFonts w:ascii="Consolas" w:hAnsi="Consolas"/>
+          <w:b/>
           <w:color w:val="3A2A1E"/>
-          <w:sz w:val="20"/>
         </w:rPr>
-        <w:t>ShapeSortSurface</w:t>
+        <w:t>Önce yapılması iyi olur:</w:t>
       </w:r>
       <w:r>
         <w:rPr>
           <w:color w:val="3A2A1E"/>
         </w:rPr>
-        <w:t xml:space="preserve"> sürükleme kalıbını veriyor. Yeni olan tek şey "miktar" tarafı: ekranda n tane nesne gösterilip doğru rakama sürüklenecek. Adımlar için 8. bölüme bak.</w:t>
+        <w:t xml:space="preserve"> Say ve Eşleştir henüz yalnızca derlendi (Windows + Android), gerçek ekranda oynanmadı. Kart boyutu ve rakam tepsilerinin parmak isabeti tablette bir kez görülmeli.</w:t>
       </w:r>
     </w:p>
     <w:p>
@@ -360,6 +384,17 @@
         <w:rPr>
           <w:color w:val="3A2A1E"/>
         </w:rPr>
+        <w:t>Say ve Eşleştir: nesne kümesi sürüklenip rakama bırakılıyor; miktar aralığı, çeldirici uzaklığı ve nesne dizilişi banda göre değişiyor</w:t>
+      </w:r>
+    </w:p>
+    <w:p>
+      <w:pPr>
+        <w:pStyle w:val="ListBullet"/>
+      </w:pPr>
+      <w:r>
+        <w:rPr>
+          <w:color w:val="3A2A1E"/>
+        </w:rPr>
         <w:t>Sıralı oyun (pass-and-play): devir katmanı, her çocuk kendi bandında</w:t>
       </w:r>
     </w:p>
@@ -471,7 +506,7 @@
           <w:b/>
           <w:color w:val="3A2A1E"/>
         </w:rPr>
-        <w:t>Öncelik 3 — Faz 2, kalan beş oyun.</w:t>
+        <w:t>Öncelik 3 — Faz 2, kalan dört oyun.</w:t>
       </w:r>
       <w:r>
         <w:rPr>
@@ -488,32 +523,7 @@
         <w:rPr>
           <w:color w:val="3A2A1E"/>
         </w:rPr>
-        <w:t xml:space="preserve">Say ve Eşleştir (öğretici; </w:t>
-      </w:r>
-      <w:r>
-        <w:rPr>
-          <w:rFonts w:ascii="Consolas" w:hAnsi="Consolas"/>
-          <w:color w:val="3A2A1E"/>
-          <w:sz w:val="20"/>
-        </w:rPr>
-        <w:t>GlyphTileView</w:t>
-      </w:r>
-      <w:r>
-        <w:rPr>
-          <w:color w:val="3A2A1E"/>
-        </w:rPr>
-        <w:t xml:space="preserve"> ve ShapeSortSurface'in sürükleme kalıbı hazır, en hızlı eklenecek olan bu)</w:t>
-      </w:r>
-    </w:p>
-    <w:p>
-      <w:pPr>
-        <w:pStyle w:val="ListNumber"/>
-      </w:pPr>
-      <w:r>
-        <w:rPr>
-          <w:color w:val="3A2A1E"/>
-        </w:rPr>
-        <w:t>Sırayı Tekrarla (ritim/zamanlama — yeni bir zamanlayıcı kalıbı gerekiyor)</w:t>
+        <w:t>Sırayı Tekrarla (ritim/zamanlama — yeni bir zamanlayıcı kalıbı gerekiyor; ekranın kendi kendine bir şey oynattığı ilk oyun)</w:t>
       </w:r>
     </w:p>
     <w:p>
@@ -707,7 +717,18 @@
         <w:rPr>
           <w:color w:val="3A2A1E"/>
         </w:rPr>
-        <w:t>Av oyunlarında sesli yönerge yok; şu an yönerge tamamen görsel (aranan işaret büyük gösteriliyor). Ses varlıkları gelince "bunu bul" seslendirmesi eklenebilir ama oyun sessiz de tam çalışıyor</w:t>
+        <w:t>Öğretici oyunlarda sesli yönerge yok; şu an yönerge tamamen görsel (avda aranan işaret büyük gösteriliyor, Say ve Eşleştir'de küme ve rakamlar aynı ekranda duruyor). Ses varlıkları gelince seslendirme eklenebilir ama üçü de sessiz hâliyle tam çalışıyor</w:t>
+      </w:r>
+    </w:p>
+    <w:p>
+      <w:pPr>
+        <w:pStyle w:val="ListBullet"/>
+      </w:pPr>
+      <w:r>
+        <w:rPr>
+          <w:color w:val="3A2A1E"/>
+        </w:rPr>
+        <w:t>Say ve Eşleştir gerçek ekranda oynanmadı; yalnızca Windows ve Android'de derlendi. Kart boyutu ve rakam tepsilerinin parmak isabeti görülmeli</w:t>
       </w:r>
     </w:p>
     <w:p>
@@ -962,6 +983,94 @@
           <w:color w:val="3A2A1E"/>
         </w:rPr>
         <w:t xml:space="preserve"> Yukarıdaki son iki madde Windows'ta sessizce geçiyordu. Değişiklik sonrası Android'de de çalıştır.</w:t>
+      </w:r>
+    </w:p>
+    <w:p>
+      <w:pPr>
+        <w:pStyle w:val="ListBullet"/>
+      </w:pPr>
+      <w:r>
+        <w:rPr>
+          <w:b/>
+          <w:color w:val="3A2A1E"/>
+        </w:rPr>
+        <w:t>Canvas'a yazı SKFont ile çiziliyor.</w:t>
+      </w:r>
+      <w:r>
+        <w:rPr>
+          <w:color w:val="3A2A1E"/>
+        </w:rPr>
+        <w:t xml:space="preserve"> SkiaSharp 3'te </w:t>
+      </w:r>
+      <w:r>
+        <w:rPr>
+          <w:rFonts w:ascii="Consolas" w:hAnsi="Consolas"/>
+          <w:color w:val="3A2A1E"/>
+          <w:sz w:val="20"/>
+        </w:rPr>
+        <w:t>SKPaint.TextSize</w:t>
+      </w:r>
+      <w:r>
+        <w:rPr>
+          <w:color w:val="3A2A1E"/>
+        </w:rPr>
+        <w:t xml:space="preserve"> ve paint üzerinden yazı çizme kalktı; doğru çağrı </w:t>
+      </w:r>
+      <w:r>
+        <w:rPr>
+          <w:rFonts w:ascii="Consolas" w:hAnsi="Consolas"/>
+          <w:color w:val="3A2A1E"/>
+          <w:sz w:val="20"/>
+        </w:rPr>
+        <w:t>canvas.DrawText(metin, x, y, SKTextAlign.Center, font, paint)</w:t>
+      </w:r>
+      <w:r>
+        <w:rPr>
+          <w:color w:val="3A2A1E"/>
+        </w:rPr>
+        <w:t xml:space="preserve"> ve font ayrı bir </w:t>
+      </w:r>
+      <w:r>
+        <w:rPr>
+          <w:rFonts w:ascii="Consolas" w:hAnsi="Consolas"/>
+          <w:color w:val="3A2A1E"/>
+          <w:sz w:val="20"/>
+        </w:rPr>
+        <w:t>SKFont</w:t>
+      </w:r>
+      <w:r>
+        <w:rPr>
+          <w:color w:val="3A2A1E"/>
+        </w:rPr>
+        <w:t xml:space="preserve"> nesnesi (atılması gerekiyor). Dikey ortalama da elde yapılıyor: taban çizgisine göre çizmek 1 ile 8'i farklı yüksekliklere düşürüyor, </w:t>
+      </w:r>
+      <w:r>
+        <w:rPr>
+          <w:rFonts w:ascii="Consolas" w:hAnsi="Consolas"/>
+          <w:color w:val="3A2A1E"/>
+          <w:sz w:val="20"/>
+        </w:rPr>
+        <w:t>font.Metrics</w:t>
+      </w:r>
+      <w:r>
+        <w:rPr>
+          <w:color w:val="3A2A1E"/>
+        </w:rPr>
+        <w:t xml:space="preserve"> ile ortalanmalı. Örnek: </w:t>
+      </w:r>
+      <w:r>
+        <w:rPr>
+          <w:rFonts w:ascii="Consolas" w:hAnsi="Consolas"/>
+          <w:color w:val="3A2A1E"/>
+          <w:sz w:val="20"/>
+        </w:rPr>
+        <w:t>CountMatchSurface</w:t>
+      </w:r>
+      <w:r>
+        <w:rPr>
+          <w:color w:val="3A2A1E"/>
+        </w:rPr>
+        <w:t>.</w:t>
       </w:r>
     </w:p>
     <w:p>

</xml_diff>

<commit_message>
Ekran yönünü yatayda kilitle
Bütün oyun yerleşimleri yatay tablet düşünülerek ölçüldü; emülatörde dikey
çalıştığında oyunların ortasında yarım ekranlık boşluklar kaldığı görüldü.
Android'de SensorLandscape, iOS'ta Info.plist yalnızca yatay. Landscape
değil SensorLandscape: çocuk tableti ters çevirdiğinde görüntü dönüyor,
ekran baş aşağı kalmıyor.

Kilitledikten sonra ana ekranda kartların ekran boyu şeritlere dönüştüğü
görüldü — sütun sayısı sabit ikiydi. Artık sayfa genişliğinden
hesaplanıyor: 900 birimin altında iki, üstünde üç sütun.

Co-Authored-By: Claude Opus 5 <noreply@anthropic.com>
</commit_message>
<xml_diff>
--- a/ilerleme notu.docx
+++ b/ilerleme notu.docx
@@ -311,6 +311,59 @@
       <w:pPr/>
       <w:r>
         <w:rPr>
+          <w:b/>
+          <w:color w:val="3A2A1E"/>
+        </w:rPr>
+        <w:t>Ekran yönü yatayda kilitlendi.</w:t>
+      </w:r>
+      <w:r>
+        <w:rPr>
+          <w:color w:val="3A2A1E"/>
+        </w:rPr>
+        <w:t xml:space="preserve"> Emülatörde dikey çalıştığında oyunların ortasında yarım ekranlık boşluklar kaldığı görüldü; bütün yerleşimler yatay tablet düşünülerek ölçülmüştü. Android'de </w:t>
+      </w:r>
+      <w:r>
+        <w:rPr>
+          <w:rFonts w:ascii="Consolas" w:hAnsi="Consolas"/>
+          <w:color w:val="3A2A1E"/>
+          <w:sz w:val="20"/>
+        </w:rPr>
+        <w:t>SensorLandscape</w:t>
+      </w:r>
+      <w:r>
+        <w:rPr>
+          <w:color w:val="3A2A1E"/>
+        </w:rPr>
+        <w:t xml:space="preserve"> (kilitli ama iki yön de serbest, çocuk tableti ters çevirince görüntü dönüyor), iOS'ta </w:t>
+      </w:r>
+      <w:r>
+        <w:rPr>
+          <w:rFonts w:ascii="Consolas" w:hAnsi="Consolas"/>
+          <w:color w:val="3A2A1E"/>
+          <w:sz w:val="20"/>
+        </w:rPr>
+        <w:t>Info.plist</w:t>
+      </w:r>
+      <w:r>
+        <w:rPr>
+          <w:color w:val="3A2A1E"/>
+        </w:rPr>
+        <w:t xml:space="preserve"> yalnızca yatay. İki yönü birden desteklemek her oyun için ikinci bir yerleşim yazmak demekti.</w:t>
+      </w:r>
+    </w:p>
+    <w:p>
+      <w:pPr/>
+      <w:r>
+        <w:rPr>
+          <w:color w:val="3A2A1E"/>
+        </w:rPr>
+        <w:t>Kilitledikten sonra ana ekranda kartların ekran boyu şeritlere dönüştüğü görüldü: sütun sayısı sabit ikiydi. Artık genişliğe göre — 900 birimin altında iki, üstünde üç sütun.</w:t>
+      </w:r>
+    </w:p>
+    <w:p>
+      <w:pPr/>
+      <w:r>
+        <w:rPr>
           <w:color w:val="3A2A1E"/>
         </w:rPr>
         <w:t xml:space="preserve">Kalan sorular hâlâ </w:t>
@@ -502,6 +555,17 @@
           <w:color w:val="3A2A1E"/>
         </w:rPr>
         <w:t>Üç dil (tr/en/de), ayarlardan çalışırken değiştirilebiliyor</w:t>
+      </w:r>
+    </w:p>
+    <w:p>
+      <w:pPr>
+        <w:pStyle w:val="ListBullet"/>
+      </w:pPr>
+      <w:r>
+        <w:rPr>
+          <w:color w:val="3A2A1E"/>
+        </w:rPr>
+        <w:t>Ekran yatayda kilitli; ana ekran sütun sayısını genişliğe göre seçiyor</w:t>
       </w:r>
     </w:p>
     <w:p>
@@ -913,16 +977,22 @@
       </w:pPr>
       <w:r>
         <w:rPr>
+          <w:color w:val="3A2A1E"/>
+        </w:rPr>
+        <w:t xml:space="preserve">Uygulama yalnızca </w:t>
+      </w:r>
+      <w:r>
+        <w:rPr>
           <w:b/>
           <w:color w:val="3A2A1E"/>
         </w:rPr>
-        <w:t>Ekran yönü kilitli değil.</w:t>
+        <w:t>yatay</w:t>
       </w:r>
       <w:r>
         <w:rPr>
           <w:color w:val="3A2A1E"/>
         </w:rPr>
-        <w:t xml:space="preserve"> Emülatörde dikey çalıştı ve oyunların çoğunda ortada büyük boşluklar kaldı; yerleşim değerleri yatay tablet düşünülerek seçilmişti. Ya yön kilitlenmeli ya da dikey için ayrı yerleşim gerekiyor. Kararı ertelendi çünkü ürün kararı: uygulama yalnızca yatay mı çalışacak?</w:t>
+        <w:t xml:space="preserve"> çalışıyor. Dikey desteklenmiyor ve desteklenecekse her oyun için ikinci bir yerleşim gerekiyor</w:t>
       </w:r>
     </w:p>
     <w:p>

</xml_diff>

<commit_message>
Gizlilik politikasını yayımla ve yayın anahtarını üret
Sürümü bloke eden iki iş de kod dışındaydı; ikisi de bitti.

Politika sayfaları SchiriFit ve CertPilot'taki düzene alındı: kaynak
burada docs/store/, yayın nüshası ayrı ve herkese açık ploofy-web
deposunda, GitHub Pages'ten servis ediliyor. On iki alan dolduruldu,
"Taslak" rozeti hem HTML'den hem dil değiştirici betiğinden kaldırıldı.
Yayıncı bilgileri uydurulmadı, CertPilot'un Impressum'undan alındı.

Ploofy'nin de bir Impressum'u oldu (de/en, bağlayıcı olan Almanca) —
diğer iki uygulamada vardı, burada yoktu.

Yayın anahtarı üretildi ve çalıştığı doğrulandı: anahtarla derlenen
Release paketinde apksigner artık CN=Ali Kiratli, O=Ploofy basıyor ve
"anahtar tanımlı değil" uyarısı çıkmıyor. Anahtar da parolaları da
depoya girmiyor (.gitignore); yalnızca adresler ve düzen burada.

Co-Authored-By: Claude Opus 5 <noreply@anthropic.com>
Claude-Session: https://claude.ai/code/session_015dW5XQneksEVySyyQeySMC
</commit_message>
<xml_diff>
--- a/ilerleme notu.docx
+++ b/ilerleme notu.docx
@@ -17,7 +17,7 @@
           <w:color w:val="7A6A5C"/>
           <w:sz w:val="18"/>
         </w:rPr>
-        <w:t>Son güncelleme: 29.08.2026</w:t>
+        <w:t>Son güncelleme: 02.09.2026</w:t>
       </w:r>
     </w:p>
     <w:p>
@@ -27,6 +27,15 @@
           <w:sz w:val="18"/>
         </w:rPr>
         <w:t>Depo: https://github.com/alikiratli/Ploofy (public)</w:t>
+      </w:r>
+    </w:p>
+    <w:p>
+      <w:r>
+        <w:rPr>
+          <w:color w:val="7A6A5C"/>
+          <w:sz w:val="18"/>
+        </w:rPr>
+        <w:t>Web: https://alikiratli.github.io/ploofy-web/ (gizlilik politikası + Impressum)</w:t>
       </w:r>
     </w:p>
     <w:p>
@@ -89,7 +98,23 @@
           <w:b/>
           <w:color w:val="3A2A1E"/>
         </w:rPr>
-        <w:t>Son oturumda yapılan:</w:t>
+        <w:t>Son oturumda yapılan: mağaza kapısındaki iki engel kalktı.</w:t>
+      </w:r>
+      <w:r>
+        <w:rPr>
+          <w:color w:val="3A2A1E"/>
+        </w:rPr>
+        <w:t xml:space="preserve"> Yayın anahtarı üretildi ve gizlilik politikası yayımlandı — ikisi de kod işi değildi, ikisi de sürümü bloke ediyordu. Ayrıntı aşağıda, "Yayın imzası" ve "Gizlilik politikası" başlıklarında.</w:t>
+      </w:r>
+    </w:p>
+    <w:p>
+      <w:pPr/>
+      <w:r>
+        <w:rPr>
+          <w:b/>
+          <w:color w:val="3A2A1E"/>
+        </w:rPr>
+        <w:t>Bir önceki oturumda yapılan:</w:t>
       </w:r>
       <w:r>
         <w:rPr>
@@ -818,9 +843,16 @@
       <w:pPr/>
       <w:r>
         <w:rPr>
-          <w:color w:val="3A2A1E"/>
-        </w:rPr>
-        <w:t xml:space="preserve">İki yol da atılabilir bir anahtarla denendi: anahtar verildiğinde sertifika </w:t>
+          <w:b/>
+          <w:color w:val="3A2A1E"/>
+        </w:rPr>
+        <w:t>Gerçek yayın anahtarı üretildi (02.09.2026).</w:t>
+      </w:r>
+      <w:r>
+        <w:rPr>
+          <w:color w:val="3A2A1E"/>
+        </w:rPr>
+        <w:t xml:space="preserve"> RSA 2048, 10000 gün geçerli, PKCS12; sertifika </w:t>
       </w:r>
       <w:r>
         <w:rPr>
@@ -828,13 +860,13 @@
           <w:color w:val="3A2A1E"/>
           <w:sz w:val="20"/>
         </w:rPr>
-        <w:t>CN=Ploofy Test</w:t>
-      </w:r>
-      <w:r>
-        <w:rPr>
-          <w:color w:val="3A2A1E"/>
-        </w:rPr>
-        <w:t xml:space="preserve">, verilmediğinde </w:t>
+        <w:t>CN=Ali Kiratli, O=Ploofy, L=Ennepetal, ST=Nordrhein-Westfalen, C=DE</w:t>
+      </w:r>
+      <w:r>
+        <w:rPr>
+          <w:color w:val="3A2A1E"/>
+        </w:rPr>
+        <w:t xml:space="preserve">. Dosya </w:t>
       </w:r>
       <w:r>
         <w:rPr>
@@ -842,26 +874,80 @@
           <w:color w:val="3A2A1E"/>
           <w:sz w:val="20"/>
         </w:rPr>
-        <w:t>CN=Android Debug</w:t>
-      </w:r>
-      <w:r>
-        <w:rPr>
-          <w:color w:val="3A2A1E"/>
-        </w:rPr>
-        <w:t xml:space="preserve"> ve uyarı görünüyor. Deneme anahtarı sonra silindi — </w:t>
-      </w:r>
+        <w:t>ploofy-release.keystore</w:t>
+      </w:r>
+      <w:r>
+        <w:rPr>
+          <w:color w:val="3A2A1E"/>
+        </w:rPr>
+        <w:t xml:space="preserve"> deponun kökünde ve </w:t>
+      </w:r>
+      <w:r>
+        <w:rPr>
+          <w:rFonts w:ascii="Consolas" w:hAnsi="Consolas"/>
+          <w:color w:val="3A2A1E"/>
+          <w:sz w:val="20"/>
+        </w:rPr>
+        <w:t>.gitignore</w:t>
+      </w:r>
+      <w:r>
+        <w:rPr>
+          <w:color w:val="3A2A1E"/>
+        </w:rPr>
+        <w:t xml:space="preserve">'da, dört değer </w:t>
+      </w:r>
+      <w:r>
+        <w:rPr>
+          <w:rFonts w:ascii="Consolas" w:hAnsi="Consolas"/>
+          <w:color w:val="3A2A1E"/>
+          <w:sz w:val="20"/>
+        </w:rPr>
+        <w:t>Ploofy.local.props</w:t>
+      </w:r>
+      <w:r>
+        <w:rPr>
+          <w:color w:val="3A2A1E"/>
+        </w:rPr>
+        <w:t>'ta (o da gitignore'da). Parola 32 karakterlik rastgele bir dize.</w:t>
+      </w:r>
+    </w:p>
+    <w:p>
+      <w:pPr/>
+      <w:r>
+        <w:rPr>
+          <w:color w:val="3A2A1E"/>
+        </w:rPr>
+        <w:t xml:space="preserve">Doğrulandı: anahtarla üretilen Release APK'sında </w:t>
+      </w:r>
+      <w:r>
+        <w:rPr>
+          <w:rFonts w:ascii="Consolas" w:hAnsi="Consolas"/>
+          <w:color w:val="3A2A1E"/>
+          <w:sz w:val="20"/>
+        </w:rPr>
+        <w:t>apksigner verify --print-certs</w:t>
+      </w:r>
+      <w:r>
+        <w:rPr>
+          <w:color w:val="3A2A1E"/>
+        </w:rPr>
+        <w:t xml:space="preserve"> yukarıdaki DN'i basıyor ve "yayın anahtarı tanımlı değil" uyarısı artık çıkmıyor.</w:t>
+      </w:r>
+    </w:p>
+    <w:p>
+      <w:pPr/>
       <w:r>
         <w:rPr>
           <w:b/>
           <w:color w:val="3A2A1E"/>
         </w:rPr>
-        <w:t>gerçek yayın anahtarı henüz üretilmedi</w:t>
-      </w:r>
-      <w:r>
-        <w:rPr>
-          <w:color w:val="3A2A1E"/>
-        </w:rPr>
-        <w:t>, o parolayla birlikte size ait.</w:t>
+        <w:t>İki dosyanın da makine dışında bir yedeği olmalı.</w:t>
+      </w:r>
+      <w:r>
+        <w:rPr>
+          <w:color w:val="3A2A1E"/>
+        </w:rPr>
+        <w:t xml:space="preserve"> Anahtarı kaybetmek uygulamayı kaybetmek demek: aynı anahtarla imzalanmayan bir güncellemeyi Play kabul etmiyor. Play App Signing açılırsa yükleme anahtarı yenilenebilir kalıyor — çocuk uygulamasında uzun ömür beklendiği için açılması mantıklı.</w:t>
       </w:r>
     </w:p>
     <w:p>
@@ -1069,31 +1155,16 @@
       <w:pPr/>
       <w:r>
         <w:rPr>
-          <w:color w:val="3A2A1E"/>
-        </w:rPr>
-        <w:t xml:space="preserve">Sayfa </w:t>
-      </w:r>
-      <w:r>
-        <w:rPr>
           <w:b/>
           <w:color w:val="3A2A1E"/>
         </w:rPr>
-        <w:t>taslak</w:t>
-      </w:r>
-      <w:r>
-        <w:rPr>
-          <w:color w:val="3A2A1E"/>
-        </w:rPr>
-        <w:t xml:space="preserve"> ve iki şeyle öyle olduğunu söylüyor: başlıktaki "Taslak" rozeti ve sarı işaretli on iki alan (her dilde tarih, yayıncı adı-adresi, iletişim e-postası). İkisi de yayımdan önce temizlenecek.</w:t>
-      </w:r>
-    </w:p>
-    <w:p>
-      <w:pPr/>
-      <w:r>
-        <w:rPr>
-          <w:color w:val="3A2A1E"/>
-        </w:rPr>
-        <w:t xml:space="preserve">Depo yerel olarak hazır ve ilk commit'i atıldı; uzak adresi eklenmedi çünkü adres henüz belli değil. Yeri: </w:t>
+        <w:t>Yayımlandı (02.09.2026).</w:t>
+      </w:r>
+      <w:r>
+        <w:rPr>
+          <w:color w:val="3A2A1E"/>
+        </w:rPr>
+        <w:t xml:space="preserve"> SchiriFit ve CertPilot'taki düzenin aynısı kuruldu: sayfaların kaynağı bu depoda </w:t>
       </w:r>
       <w:r>
         <w:rPr>
@@ -1101,45 +1172,13 @@
           <w:color w:val="3A2A1E"/>
           <w:sz w:val="20"/>
         </w:rPr>
-        <w:t>../ploofy-privacy</w:t>
-      </w:r>
-      <w:r>
-        <w:rPr>
-          <w:color w:val="3A2A1E"/>
-        </w:rPr>
-        <w:t xml:space="preserve"> (bu deponun kardeşi).</w:t>
-      </w:r>
-    </w:p>
-    <w:p>
-      <w:pPr/>
-      <w:r>
-        <w:rPr>
-          <w:b/>
-          <w:color w:val="3A2A1E"/>
-        </w:rPr>
-        <w:t>Sayılar:</w:t>
-      </w:r>
-      <w:r>
-        <w:rPr>
-          <w:color w:val="3A2A1E"/>
-        </w:rPr>
-        <w:t xml:space="preserve"> 229 test geçiyor · 10 oyun tanımlı, 10'u oynanabilir · 13 ses dosyası · AAB 40 MB · targetSdk 36 · sürüm 1.0.</w:t>
-      </w:r>
-    </w:p>
-    <w:p>
-      <w:pPr/>
-      <w:r>
-        <w:rPr>
-          <w:b/>
-          <w:color w:val="3A2A1E"/>
-        </w:rPr>
-        <w:t>Buradan başla: gerçek tablet.</w:t>
-      </w:r>
-      <w:r>
-        <w:rPr>
-          <w:color w:val="3A2A1E"/>
-        </w:rPr>
-        <w:t xml:space="preserve"> Emülatör her şeyi gösterdi ama iki şeyi ölçemiyor — parmağı ve hoparlörü. Tableti USB'den tak, hata ayıklamayı aç, </w:t>
+        <w:t>docs/store/</w:t>
+      </w:r>
+      <w:r>
+        <w:rPr>
+          <w:color w:val="3A2A1E"/>
+        </w:rPr>
+        <w:t xml:space="preserve">, yayın nüshası ayrı ve herkese açık </w:t>
       </w:r>
       <w:r>
         <w:rPr>
@@ -1147,13 +1186,13 @@
           <w:color w:val="3A2A1E"/>
           <w:sz w:val="20"/>
         </w:rPr>
-        <w:t>dotnet build src/Ploofy.App/Ploofy.App.csproj -f net10.0-android -t:Run</w:t>
-      </w:r>
-      <w:r>
-        <w:rPr>
-          <w:color w:val="3A2A1E"/>
-        </w:rPr>
-        <w:t>. Bakılacaklar:</w:t>
+        <w:t>alikiratli/ploofy-web</w:t>
+      </w:r>
+      <w:r>
+        <w:rPr>
+          <w:color w:val="3A2A1E"/>
+        </w:rPr>
+        <w:t xml:space="preserve"> deposunda, GitHub Pages'ten servis ediliyor. Üçü de 200 dönüyor:</w:t>
       </w:r>
     </w:p>
     <w:p>
@@ -1162,16 +1201,22 @@
       </w:pPr>
       <w:r>
         <w:rPr>
+          <w:color w:val="3A2A1E"/>
+        </w:rPr>
+        <w:t xml:space="preserve">https://alikiratli.github.io/ploofy-web/privacy-policy.html — Play Console'a </w:t>
+      </w:r>
+      <w:r>
+        <w:rPr>
           <w:b/>
           <w:color w:val="3A2A1E"/>
         </w:rPr>
-        <w:t>Sesler.</w:t>
-      </w:r>
-      <w:r>
-        <w:rPr>
-          <w:color w:val="3A2A1E"/>
-        </w:rPr>
-        <w:t xml:space="preserve"> Hiçbiri henüz kulakla duyulmadı. Ses seviyeleri birbirine göre dengeli mi (dokunuş sesi tekrar tekrar çalıyor, en alçağı o olmalı), tuş notaları ezgi gibi mi duyuluyor, tablet hoparlöründe tiz sesler (yıldız) cırlıyor mu</w:t>
+        <w:t>bu</w:t>
+      </w:r>
+      <w:r>
+        <w:rPr>
+          <w:color w:val="3A2A1E"/>
+        </w:rPr>
+        <w:t xml:space="preserve"> adres girilecek, kök değil; denetim sayfanın kendisini görsün</w:t>
       </w:r>
     </w:p>
     <w:p>
@@ -1182,7 +1227,7 @@
         <w:rPr>
           <w:color w:val="3A2A1E"/>
         </w:rPr>
-        <w:t>Yolu Bul'da Meşe toleransı (0,055) parmak ucuyla tutturulabiliyor mu — bunların en riskli olanı bu</w:t>
+        <w:t>https://alikiratli.github.io/ploofy-web/impressum.html</w:t>
       </w:r>
     </w:p>
     <w:p>
@@ -1193,7 +1238,135 @@
         <w:rPr>
           <w:color w:val="3A2A1E"/>
         </w:rPr>
-        <w:t>Sepeti Tut'ta düşme hızı Fidan bandında adil mi, sepet parmağı gecikmeden takip ediyor mu</w:t>
+        <w:t>https://alikiratli.github.io/ploofy-web/ — mağaza girişindeki "Web sitesi"</w:t>
+      </w:r>
+    </w:p>
+    <w:p>
+      <w:pPr/>
+      <w:r>
+        <w:rPr>
+          <w:color w:val="3A2A1E"/>
+        </w:rPr>
+        <w:t>On iki alan dolduruldu (2 Eylül 2026 · Ali Kiratli, Ischebecker Straße 8, 58256 Ennepetal · alikiratlide@gmail.com) ve "Taslak" rozeti hem HTML'den hem betikten kaldırıldı. Yayıncı bilgileri uydurulmadı; CertPilot'un Impressum'undan alındı.</w:t>
+      </w:r>
+    </w:p>
+    <w:p>
+      <w:pPr/>
+      <w:r>
+        <w:rPr>
+          <w:color w:val="3A2A1E"/>
+        </w:rPr>
+        <w:t xml:space="preserve">Ploofy'nin de bir </w:t>
+      </w:r>
+      <w:r>
+        <w:rPr>
+          <w:b/>
+          <w:color w:val="3A2A1E"/>
+        </w:rPr>
+        <w:t>Impressum</w:t>
+      </w:r>
+      <w:r>
+        <w:rPr>
+          <w:color w:val="3A2A1E"/>
+        </w:rPr>
+        <w:t>'u oldu (de/en, bağlayıcı olan Almanca) — diğer iki uygulamada var, burada yoktu. § 5 DDG, § 19 UStG Kleinunternehmer, § 18/2 MStV, § 36 VSBG; artı aboneliğin mağazayla kurulduğunu söyleyen bir bölüm.</w:t>
+      </w:r>
+    </w:p>
+    <w:p>
+      <w:pPr/>
+      <w:r>
+        <w:rPr>
+          <w:color w:val="3A2A1E"/>
+        </w:rPr>
+        <w:t xml:space="preserve">Eski </w:t>
+      </w:r>
+      <w:r>
+        <w:rPr>
+          <w:rFonts w:ascii="Consolas" w:hAnsi="Consolas"/>
+          <w:color w:val="3A2A1E"/>
+          <w:sz w:val="20"/>
+        </w:rPr>
+        <w:t>../ploofy-privacy</w:t>
+      </w:r>
+      <w:r>
+        <w:rPr>
+          <w:color w:val="3A2A1E"/>
+        </w:rPr>
+        <w:t xml:space="preserve"> yerel deposu artık gereksiz — içeriği </w:t>
+      </w:r>
+      <w:r>
+        <w:rPr>
+          <w:rFonts w:ascii="Consolas" w:hAnsi="Consolas"/>
+          <w:color w:val="3A2A1E"/>
+          <w:sz w:val="20"/>
+        </w:rPr>
+        <w:t>docs/store/</w:t>
+      </w:r>
+      <w:r>
+        <w:rPr>
+          <w:color w:val="3A2A1E"/>
+        </w:rPr>
+        <w:t xml:space="preserve"> ile </w:t>
+      </w:r>
+      <w:r>
+        <w:rPr>
+          <w:rFonts w:ascii="Consolas" w:hAnsi="Consolas"/>
+          <w:color w:val="3A2A1E"/>
+          <w:sz w:val="20"/>
+        </w:rPr>
+        <w:t>ploofy-web</w:t>
+      </w:r>
+      <w:r>
+        <w:rPr>
+          <w:color w:val="3A2A1E"/>
+        </w:rPr>
+        <w:t>'e taşındı.</w:t>
+      </w:r>
+    </w:p>
+    <w:p>
+      <w:pPr/>
+      <w:r>
+        <w:rPr>
+          <w:b/>
+          <w:color w:val="3A2A1E"/>
+        </w:rPr>
+        <w:t>Sayılar:</w:t>
+      </w:r>
+      <w:r>
+        <w:rPr>
+          <w:color w:val="3A2A1E"/>
+        </w:rPr>
+        <w:t xml:space="preserve"> 229 test geçiyor · 10 oyun tanımlı, 10'u oynanabilir · 13 ses dosyası · AAB 40 MB · targetSdk 36 · sürüm 1.0.</w:t>
+      </w:r>
+    </w:p>
+    <w:p>
+      <w:pPr/>
+      <w:r>
+        <w:rPr>
+          <w:b/>
+          <w:color w:val="3A2A1E"/>
+        </w:rPr>
+        <w:t>Buradan başla: gerçek tablet.</w:t>
+      </w:r>
+      <w:r>
+        <w:rPr>
+          <w:color w:val="3A2A1E"/>
+        </w:rPr>
+        <w:t xml:space="preserve"> Emülatör her şeyi gösterdi ama iki şeyi ölçemiyor — parmağı ve hoparlörü. Tableti USB'den tak, hata ayıklamayı aç, </w:t>
+      </w:r>
+      <w:r>
+        <w:rPr>
+          <w:rFonts w:ascii="Consolas" w:hAnsi="Consolas"/>
+          <w:color w:val="3A2A1E"/>
+          <w:sz w:val="20"/>
+        </w:rPr>
+        <w:t>dotnet build src/Ploofy.App/Ploofy.App.csproj -f net10.0-android -t:Run</w:t>
+      </w:r>
+      <w:r>
+        <w:rPr>
+          <w:color w:val="3A2A1E"/>
+        </w:rPr>
+        <w:t>. Bakılacaklar:</w:t>
       </w:r>
     </w:p>
     <w:p>
@@ -1202,9 +1375,16 @@
       </w:pPr>
       <w:r>
         <w:rPr>
-          <w:color w:val="3A2A1E"/>
-        </w:rPr>
-        <w:t>Sırayı Tekrarla'da 750 ms gösterim hızı Filiz bandında takip edilebiliyor mu</w:t>
+          <w:b/>
+          <w:color w:val="3A2A1E"/>
+        </w:rPr>
+        <w:t>Sesler.</w:t>
+      </w:r>
+      <w:r>
+        <w:rPr>
+          <w:color w:val="3A2A1E"/>
+        </w:rPr>
+        <w:t xml:space="preserve"> Hiçbiri henüz kulakla duyulmadı. Ses seviyeleri birbirine göre dengeli mi (dokunuş sesi tekrar tekrar çalıyor, en alçağı o olmalı), tuş notaları ezgi gibi mi duyuluyor, tablet hoparlöründe tiz sesler (yıldız) cırlıyor mu</w:t>
       </w:r>
     </w:p>
     <w:p>
@@ -1215,7 +1395,7 @@
         <w:rPr>
           <w:color w:val="3A2A1E"/>
         </w:rPr>
-        <w:t>Yapboz'da Meşe'nin on altı parçası bir turu fazla uzatıyor mu</w:t>
+        <w:t>Yolu Bul'da Meşe toleransı (0,055) parmak ucuyla tutturulabiliyor mu — bunların en riskli olanı bu</w:t>
       </w:r>
     </w:p>
     <w:p>
@@ -1226,6 +1406,39 @@
         <w:rPr>
           <w:color w:val="3A2A1E"/>
         </w:rPr>
+        <w:t>Sepeti Tut'ta düşme hızı Fidan bandında adil mi, sepet parmağı gecikmeden takip ediyor mu</w:t>
+      </w:r>
+    </w:p>
+    <w:p>
+      <w:pPr>
+        <w:pStyle w:val="ListBullet"/>
+      </w:pPr>
+      <w:r>
+        <w:rPr>
+          <w:color w:val="3A2A1E"/>
+        </w:rPr>
+        <w:t>Sırayı Tekrarla'da 750 ms gösterim hızı Filiz bandında takip edilebiliyor mu</w:t>
+      </w:r>
+    </w:p>
+    <w:p>
+      <w:pPr>
+        <w:pStyle w:val="ListBullet"/>
+      </w:pPr>
+      <w:r>
+        <w:rPr>
+          <w:color w:val="3A2A1E"/>
+        </w:rPr>
+        <w:t>Yapboz'da Meşe'nin on altı parçası bir turu fazla uzatıyor mu</w:t>
+      </w:r>
+    </w:p>
+    <w:p>
+      <w:pPr>
+        <w:pStyle w:val="ListBullet"/>
+      </w:pPr>
+      <w:r>
+        <w:rPr>
+          <w:color w:val="3A2A1E"/>
+        </w:rPr>
         <w:t>İkon başlatıcıda nasıl duruyor (uyarlanabilir maske yüzü kırpıyor mu)</w:t>
       </w:r>
     </w:p>
@@ -1363,13 +1576,27 @@
           <w:b/>
           <w:color w:val="3A2A1E"/>
         </w:rPr>
-        <w:t>tools/build_strings.py</w:t>
-      </w:r>
-      <w:r>
-        <w:rPr>
-          <w:color w:val="3A2A1E"/>
-        </w:rPr>
-        <w:t xml:space="preserve"> — strings.tsv'den resx üretir</w:t>
+        <w:t>docs/store</w:t>
+      </w:r>
+      <w:r>
+        <w:rPr>
+          <w:color w:val="3A2A1E"/>
+        </w:rPr>
+        <w:t xml:space="preserve"> — gizlilik politikası, Impressum ve tanıtım sayfası; yayın nüshası </w:t>
+      </w:r>
+      <w:r>
+        <w:rPr>
+          <w:rFonts w:ascii="Consolas" w:hAnsi="Consolas"/>
+          <w:color w:val="3A2A1E"/>
+          <w:sz w:val="20"/>
+        </w:rPr>
+        <w:t>alikiratli/ploofy-web</w:t>
+      </w:r>
+      <w:r>
+        <w:rPr>
+          <w:color w:val="3A2A1E"/>
+        </w:rPr>
+        <w:t xml:space="preserve"> deposunda</w:t>
       </w:r>
     </w:p>
     <w:p>
@@ -1381,6 +1608,24 @@
           <w:b/>
           <w:color w:val="3A2A1E"/>
         </w:rPr>
+        <w:t>tools/build_strings.py</w:t>
+      </w:r>
+      <w:r>
+        <w:rPr>
+          <w:color w:val="3A2A1E"/>
+        </w:rPr>
+        <w:t xml:space="preserve"> — strings.tsv'den resx üretir</w:t>
+      </w:r>
+    </w:p>
+    <w:p>
+      <w:pPr>
+        <w:pStyle w:val="ListBullet"/>
+      </w:pPr>
+      <w:r>
+        <w:rPr>
+          <w:b/>
+          <w:color w:val="3A2A1E"/>
+        </w:rPr>
         <w:t>tools/build_sounds.py</w:t>
       </w:r>
       <w:r>
@@ -1713,13 +1958,13 @@
           <w:b/>
           <w:color w:val="3A2A1E"/>
         </w:rPr>
-        <w:t>Öncelik 3 — Yayın anahtarını üret.</w:t>
-      </w:r>
-      <w:r>
-        <w:rPr>
-          <w:color w:val="3A2A1E"/>
-        </w:rPr>
-        <w:t xml:space="preserve"> Yapılandırma hazır (1. bölüm); eksik olan tek şey anahtarın kendisi. Komut README'de, "Yayın imzası" başlığı. Anahtarı kaybetmek uygulamayı kaybetmek demek: aynı anahtarla imzalanmayan bir güncelleme Play'e yüklenemiyor. Play App Signing açılırsa yükleme anahtarı yenilenebilir kalıyor — çocuk uygulamasında uzun ömür beklendiği için açılması mantıklı.</w:t>
+        <w:t>Öncelik 3 — iOS.</w:t>
+      </w:r>
+      <w:r>
+        <w:rPr>
+          <w:color w:val="3A2A1E"/>
+        </w:rPr>
+        <w:t xml:space="preserve"> Hiç denenmedi. Mac gerektiriyor.</w:t>
       </w:r>
     </w:p>
     <w:p>
@@ -1729,13 +1974,13 @@
           <w:b/>
           <w:color w:val="3A2A1E"/>
         </w:rPr>
-        <w:t>Öncelik 4 — Gizlilik politikasını yayımla.</w:t>
-      </w:r>
-      <w:r>
-        <w:rPr>
-          <w:color w:val="3A2A1E"/>
-        </w:rPr>
-        <w:t xml:space="preserve"> Sayfa hazır ve ayrı deposunda duruyor (</w:t>
+        <w:t>Öncelik 4 — Mağaza vitrini.</w:t>
+      </w:r>
+      <w:r>
+        <w:rPr>
+          <w:color w:val="3A2A1E"/>
+        </w:rPr>
+        <w:t xml:space="preserve"> Play Console yaş beyanı, App Store Kids kategorisi, Data safety formu, içerik derecelendirme anketi, ekran görüntüleri ve üç dilde tanıtım metinleri. İkon ve açılış ekranı tamam. Gizlilik politikası URL'i hazır (1. bölüm); Play Console'a </w:t>
       </w:r>
       <w:r>
         <w:rPr>
@@ -1743,13 +1988,41 @@
           <w:color w:val="3A2A1E"/>
           <w:sz w:val="20"/>
         </w:rPr>
-        <w:t>../ploofy-privacy</w:t>
-      </w:r>
-      <w:r>
-        <w:rPr>
-          <w:color w:val="3A2A1E"/>
-        </w:rPr>
-        <w:t>, ilk commit atılmış). Kalanlar: GitHub'da depoyu açıp uzak adresi bağlamak, Pages'i açmak, on iki alanı doldurup "Taslak" rozetini kaldırmak, sonra adresi hem buradaki README'ye hem Play Console'a yazmak.</w:t>
+        <w:t>privacy-policy.html</w:t>
+      </w:r>
+      <w:r>
+        <w:rPr>
+          <w:color w:val="3A2A1E"/>
+        </w:rPr>
+        <w:t xml:space="preserve"> doğrudan girilecek. Sürüm </w:t>
+      </w:r>
+      <w:r>
+        <w:rPr>
+          <w:rFonts w:ascii="Consolas" w:hAnsi="Consolas"/>
+          <w:color w:val="3A2A1E"/>
+          <w:sz w:val="20"/>
+        </w:rPr>
+        <w:t>1.0</w:t>
+      </w:r>
+      <w:r>
+        <w:rPr>
+          <w:color w:val="3A2A1E"/>
+        </w:rPr>
+        <w:t xml:space="preserve">, versionCode </w:t>
+      </w:r>
+      <w:r>
+        <w:rPr>
+          <w:rFonts w:ascii="Consolas" w:hAnsi="Consolas"/>
+          <w:color w:val="3A2A1E"/>
+          <w:sz w:val="20"/>
+        </w:rPr>
+        <w:t>1</w:t>
+      </w:r>
+      <w:r>
+        <w:rPr>
+          <w:color w:val="3A2A1E"/>
+        </w:rPr>
+        <w:t xml:space="preserve"> — Play'e her yüklemede versionCode'un artması gerekiyor.</w:t>
       </w:r>
     </w:p>
     <w:p>
@@ -1758,81 +2031,7 @@
         <w:rPr>
           <w:color w:val="3A2A1E"/>
         </w:rPr>
-        <w:t>İki uyarı: 4. bölüm (abonelik) gerçek billing bağlanmadan doğru değil, çünkü satın almanın Play üzerinden yürüdüğünü anlatıyor. Ve metnin bir hukukçuya okutulması yerinde olur — iddialar koda dayanıyor ama yasal biçim ayrı bir iş.</w:t>
-      </w:r>
-    </w:p>
-    <w:p>
-      <w:pPr/>
-      <w:r>
-        <w:rPr>
-          <w:b/>
-          <w:color w:val="3A2A1E"/>
-        </w:rPr>
-        <w:t>Öncelik 5 — iOS.</w:t>
-      </w:r>
-      <w:r>
-        <w:rPr>
-          <w:color w:val="3A2A1E"/>
-        </w:rPr>
-        <w:t xml:space="preserve"> Hiç denenmedi. Mac gerektiriyor.</w:t>
-      </w:r>
-    </w:p>
-    <w:p>
-      <w:pPr/>
-      <w:r>
-        <w:rPr>
-          <w:b/>
-          <w:color w:val="3A2A1E"/>
-        </w:rPr>
-        <w:t>Öncelik 6 — Mağaza vitrini.</w:t>
-      </w:r>
-      <w:r>
-        <w:rPr>
-          <w:color w:val="3A2A1E"/>
-        </w:rPr>
-        <w:t xml:space="preserve"> Play Console yaş beyanı, App Store Kids kategorisi, Data safety formu, içerik derecelendirme anketi, ekran görüntüleri ve üç dilde tanıtım metinleri. İkon ve açılış ekranı tamam. Sürüm numarası da ilk yayından önce </w:t>
-      </w:r>
-      <w:r>
-        <w:rPr>
-          <w:rFonts w:ascii="Consolas" w:hAnsi="Consolas"/>
-          <w:color w:val="3A2A1E"/>
-          <w:sz w:val="20"/>
-        </w:rPr>
-        <w:t>1.0</w:t>
-      </w:r>
-      <w:r>
-        <w:rPr>
-          <w:color w:val="3A2A1E"/>
-        </w:rPr>
-        <w:t xml:space="preserve"> olmalı; şu an </w:t>
-      </w:r>
-      <w:r>
-        <w:rPr>
-          <w:rFonts w:ascii="Consolas" w:hAnsi="Consolas"/>
-          <w:color w:val="3A2A1E"/>
-          <w:sz w:val="20"/>
-        </w:rPr>
-        <w:t>0.1</w:t>
-      </w:r>
-      <w:r>
-        <w:rPr>
-          <w:color w:val="3A2A1E"/>
-        </w:rPr>
-        <w:t xml:space="preserve"> / kod </w:t>
-      </w:r>
-      <w:r>
-        <w:rPr>
-          <w:rFonts w:ascii="Consolas" w:hAnsi="Consolas"/>
-          <w:color w:val="3A2A1E"/>
-          <w:sz w:val="20"/>
-        </w:rPr>
-        <w:t>1</w:t>
-      </w:r>
-      <w:r>
-        <w:rPr>
-          <w:color w:val="3A2A1E"/>
-        </w:rPr>
-        <w:t>.</w:t>
+        <w:t>İki uyarı politikanın metniyle ilgili: 4. bölümü (abonelik) gerçek billing bağlanmadan tam doğru değil, çünkü satın almanın Play üzerinden yürüdüğünü anlatıyor — Öncelik 2 ile birlikte gözden geçirilmeli. Ve metnin bir hukukçuya okutulması yerinde olur; iddialar koda dayanıyor ama yasal biçim ayrı bir iş.</w:t>
       </w:r>
     </w:p>
     <w:p>
@@ -1862,18 +2061,35 @@
         <w:rPr>
           <w:color w:val="3A2A1E"/>
         </w:rPr>
-        <w:t>Yayın anahtarı henüz üretilmedi; imzalama yapılandırması hazır ama anahtar yokken paket hata ayıklama sertifikasıyla çıkıyor</w:t>
-      </w:r>
-    </w:p>
-    <w:p>
-      <w:pPr>
-        <w:pStyle w:val="ListBullet"/>
-      </w:pPr>
-      <w:r>
-        <w:rPr>
-          <w:color w:val="3A2A1E"/>
-        </w:rPr>
-        <w:t>Gizlilik politikası sayfası hazır ama yayımlanmadı: depo yerelde, uzak adresi yok, on iki alan hâlâ boş ve "Taslak" rozeti duruyor</w:t>
+        <w:t xml:space="preserve">Yayın anahtarının makine dışında yedeği yok; </w:t>
+      </w:r>
+      <w:r>
+        <w:rPr>
+          <w:rFonts w:ascii="Consolas" w:hAnsi="Consolas"/>
+          <w:color w:val="3A2A1E"/>
+          <w:sz w:val="20"/>
+        </w:rPr>
+        <w:t>ploofy-release.keystore</w:t>
+      </w:r>
+      <w:r>
+        <w:rPr>
+          <w:color w:val="3A2A1E"/>
+        </w:rPr>
+        <w:t xml:space="preserve"> ve </w:t>
+      </w:r>
+      <w:r>
+        <w:rPr>
+          <w:rFonts w:ascii="Consolas" w:hAnsi="Consolas"/>
+          <w:color w:val="3A2A1E"/>
+          <w:sz w:val="20"/>
+        </w:rPr>
+        <w:t>Ploofy.local.props</w:t>
+      </w:r>
+      <w:r>
+        <w:rPr>
+          <w:color w:val="3A2A1E"/>
+        </w:rPr>
+        <w:t xml:space="preserve"> yalnızca bu bilgisayarda duruyor</w:t>
       </w:r>
     </w:p>
     <w:p>

</xml_diff>

<commit_message>
İlerleme notuna kaldığımız yeri yaz
Oturum sonu ritüeli. 1. bölümün sonundaki "buradan başla" bloğu, son
commit'i ve sıradaki maddeyi (İ5) söyleyen bir bölüme dönüştü.

Cihaz testi listesi de büyüdü: dört yeni oyun hiç dokunulmadan yazıldı.
Harf Yazma'nın harfleri sayısal olarak sağlam ama hiçbir ekranda
görülmedi; Sırala'nın Meşe miktarları ile Örüntü'nün dokuz kutucuğu da
ancak parmakla anlaşılır.

Co-Authored-By: Claude Opus 5 <noreply@anthropic.com>
Claude-Session: https://claude.ai/code/session_015dW5XQneksEVySyyQeySMC
</commit_message>
<xml_diff>
--- a/ilerleme notu.docx
+++ b/ilerleme notu.docx
@@ -17,7 +17,7 @@
           <w:color w:val="7A6A5C"/>
           <w:sz w:val="18"/>
         </w:rPr>
-        <w:t>Son güncelleme: 02.09.2026</w:t>
+        <w:t>Son güncelleme: 03.09.2026</w:t>
       </w:r>
     </w:p>
     <w:p>
@@ -2716,19 +2716,116 @@
       </w:r>
     </w:p>
     <w:p>
+      <w:pPr>
+        <w:pStyle w:val="Heading2"/>
+      </w:pPr>
+      <w:r>
+        <w:t>Nerede bırakıldı (03.09.2026)</w:t>
+      </w:r>
+    </w:p>
+    <w:p>
       <w:pPr/>
       <w:r>
         <w:rPr>
+          <w:color w:val="3A2A1E"/>
+        </w:rPr>
+        <w:t xml:space="preserve">Son commit: </w:t>
+      </w:r>
+      <w:r>
+        <w:rPr>
+          <w:rFonts w:ascii="Consolas" w:hAnsi="Consolas"/>
+          <w:color w:val="3A2A1E"/>
+          <w:sz w:val="20"/>
+        </w:rPr>
+        <w:t>a63b3ce</w:t>
+      </w:r>
+      <w:r>
+        <w:rPr>
+          <w:color w:val="3A2A1E"/>
+        </w:rPr>
+        <w:t xml:space="preserve"> — Sırala. Çalışma ağacı temiz, </w:t>
+      </w:r>
+      <w:r>
+        <w:rPr>
+          <w:rFonts w:ascii="Consolas" w:hAnsi="Consolas"/>
+          <w:color w:val="3A2A1E"/>
+          <w:sz w:val="20"/>
+        </w:rPr>
+        <w:t>main</w:t>
+      </w:r>
+      <w:r>
+        <w:rPr>
+          <w:color w:val="3A2A1E"/>
+        </w:rPr>
+        <w:t xml:space="preserve"> üstünde ve </w:t>
+      </w:r>
+      <w:r>
+        <w:rPr>
           <w:b/>
           <w:color w:val="3A2A1E"/>
         </w:rPr>
-        <w:t>Buradan başla: gerçek tablet.</w:t>
-      </w:r>
-      <w:r>
-        <w:rPr>
-          <w:color w:val="3A2A1E"/>
-        </w:rPr>
-        <w:t xml:space="preserve"> Emülatör her şeyi gösterdi ama iki şeyi ölçemiyor — parmağı ve hoparlörü. Tableti USB'den tak, hata ayıklamayı aç, </w:t>
+        <w:t>uzağa gönderilmedi</w:t>
+      </w:r>
+      <w:r>
+        <w:rPr>
+          <w:color w:val="3A2A1E"/>
+        </w:rPr>
+        <w:t xml:space="preserve">; ilk iş </w:t>
+      </w:r>
+      <w:r>
+        <w:rPr>
+          <w:rFonts w:ascii="Consolas" w:hAnsi="Consolas"/>
+          <w:color w:val="3A2A1E"/>
+          <w:sz w:val="20"/>
+        </w:rPr>
+        <w:t>git push</w:t>
+      </w:r>
+      <w:r>
+        <w:rPr>
+          <w:color w:val="3A2A1E"/>
+        </w:rPr>
+        <w:t xml:space="preserve"> olabilir.</w:t>
+      </w:r>
+    </w:p>
+    <w:p>
+      <w:pPr/>
+      <w:r>
+        <w:rPr>
+          <w:color w:val="3A2A1E"/>
+        </w:rPr>
+        <w:t>Bu oturumda kapanan dört madde: yayın anahtarı, gizlilik politikasının yayımlanması, abonelik yönetimi, ve içerik yol haritasının ilk dördü (İ1 Harf Yazma, İ2 Örüntü, İ3 Ebeveyn raporu, İ4 Sırala). Kütüphane 13 oyun, testler 329.</w:t>
+      </w:r>
+    </w:p>
+    <w:p>
+      <w:pPr/>
+      <w:r>
+        <w:rPr>
+          <w:b/>
+          <w:color w:val="3A2A1E"/>
+        </w:rPr>
+        <w:t>Sıradaki iş: İ5 — yıldızların bir karşılığı.</w:t>
+      </w:r>
+      <w:r>
+        <w:rPr>
+          <w:color w:val="3A2A1E"/>
+        </w:rPr>
+        <w:t xml:space="preserve"> Şu an yıldız birikiyor ve hiçbir şey açmıyor; motivasyon döngüsü kapanmıyor. 32 emoji avatar zaten var (üç tematik grup), yani yıldızla açılan avatar/çıkartma küçük bir iş. Karar verilecek tek şey, kilidin neye bağlanacağı: toplam yıldız mı, oyun başına yıldız mı, yoksa rozetler mi. Sonrası 5. bölümdeki sıra (İ6 ekran süresi, İ7 kategori/toplama/boyama, İ8 bant içi uyarlama).</w:t>
+      </w:r>
+    </w:p>
+    <w:p>
+      <w:pPr/>
+      <w:r>
+        <w:rPr>
+          <w:b/>
+          <w:color w:val="3A2A1E"/>
+        </w:rPr>
+        <w:t>Ama asıl bekleyen hâlâ gerçek tablet.</w:t>
+      </w:r>
+      <w:r>
+        <w:rPr>
+          <w:color w:val="3A2A1E"/>
+        </w:rPr>
+        <w:t xml:space="preserve"> Emülatör her şeyi gösterdi, iki şeyi ölçemiyor: parmağı ve hoparlörü. Yeni dört oyun da hiç dokunulmadan yazıldı; bu liste onlarla birlikte büyüdü. Tableti USB'den tak, hata ayıklamayı aç, </w:t>
       </w:r>
       <w:r>
         <w:rPr>
@@ -2760,7 +2857,7 @@
         <w:rPr>
           <w:color w:val="3A2A1E"/>
         </w:rPr>
-        <w:t xml:space="preserve"> Hiçbiri henüz kulakla duyulmadı. Ses seviyeleri birbirine göre dengeli mi (dokunuş sesi tekrar tekrar çalıyor, en alçağı o olmalı), tuş notaları ezgi gibi mi duyuluyor, tablet hoparlöründe tiz sesler (yıldız) cırlıyor mu</w:t>
+        <w:t xml:space="preserve"> Hiçbiri henüz kulakla duyulmadı. Ses seviyeleri birbirine göre dengeli mi (dokunuş sesi tekrar tekrar çalıyor, en alçağı o olmalı), tuş notaları ezgi gibi mi duyuluyor, tablet hoparlöründe tiz sesler (yıldız) cırlıyor mu. Ayarlardaki "Sesleri dene" düğmesi tam bunun için</w:t>
       </w:r>
     </w:p>
     <w:p>
@@ -2780,9 +2877,30 @@
       </w:pPr>
       <w:r>
         <w:rPr>
-          <w:color w:val="3A2A1E"/>
-        </w:rPr>
-        <w:t>Sepeti Tut'ta düşme hızı Fidan bandında adil mi, sepet parmağı gecikmeden takip ediyor mu</w:t>
+          <w:b/>
+          <w:color w:val="3A2A1E"/>
+        </w:rPr>
+        <w:t>Harf Yazma'da harflerin estetiği.</w:t>
+      </w:r>
+      <w:r>
+        <w:rPr>
+          <w:color w:val="3A2A1E"/>
+        </w:rPr>
+        <w:t xml:space="preserve"> Sayısal olarak sağlamlar ama S'nin kıvrımı, 6'nın halkası ve 2'nin kuyruğu hiçbir ekranda görülmedi. Nokta listeleri </w:t>
+      </w:r>
+      <w:r>
+        <w:rPr>
+          <w:rFonts w:ascii="Consolas" w:hAnsi="Consolas"/>
+          <w:color w:val="3A2A1E"/>
+          <w:sz w:val="20"/>
+        </w:rPr>
+        <w:t>GlyphShapes.cs</w:t>
+      </w:r>
+      <w:r>
+        <w:rPr>
+          <w:color w:val="3A2A1E"/>
+        </w:rPr>
+        <w:t xml:space="preserve"> içinde tek satırlık işler; kötü duran bir harf orada elle ayarlanır</w:t>
       </w:r>
     </w:p>
     <w:p>
@@ -2791,9 +2909,16 @@
       </w:pPr>
       <w:r>
         <w:rPr>
-          <w:color w:val="3A2A1E"/>
-        </w:rPr>
-        <w:t>Sırayı Tekrarla'da 750 ms gösterim hızı Filiz bandında takip edilebiliyor mu</w:t>
+          <w:b/>
+          <w:color w:val="3A2A1E"/>
+        </w:rPr>
+        <w:t>Sırala'da Meşe'nin ardışık miktarları</w:t>
+      </w:r>
+      <w:r>
+        <w:rPr>
+          <w:color w:val="3A2A1E"/>
+        </w:rPr>
+        <w:t xml:space="preserve"> gerçekten sayılabiliyor mu, yoksa 11 ile 12 ayırt edilemeyecek kadar mı yakın duruyor</w:t>
       </w:r>
     </w:p>
     <w:p>
@@ -2802,9 +2927,16 @@
       </w:pPr>
       <w:r>
         <w:rPr>
-          <w:color w:val="3A2A1E"/>
-        </w:rPr>
-        <w:t>Yapboz'da Meşe'nin on altı parçası bir turu fazla uzatıyor mu</w:t>
+          <w:b/>
+          <w:color w:val="3A2A1E"/>
+        </w:rPr>
+        <w:t>Örüntü'de dokuz kutucuk</w:t>
+      </w:r>
+      <w:r>
+        <w:rPr>
+          <w:color w:val="3A2A1E"/>
+        </w:rPr>
+        <w:t xml:space="preserve"> yatay ekrana sığıyor mu, dokunma hedefi 64 birimin altına düşüyor mu</w:t>
       </w:r>
     </w:p>
     <w:p>
@@ -2815,6 +2947,39 @@
         <w:rPr>
           <w:color w:val="3A2A1E"/>
         </w:rPr>
+        <w:t>Sepeti Tut'ta düşme hızı Fidan bandında adil mi, sepet parmağı gecikmeden takip ediyor mu</w:t>
+      </w:r>
+    </w:p>
+    <w:p>
+      <w:pPr>
+        <w:pStyle w:val="ListBullet"/>
+      </w:pPr>
+      <w:r>
+        <w:rPr>
+          <w:color w:val="3A2A1E"/>
+        </w:rPr>
+        <w:t>Sırayı Tekrarla'da 750 ms gösterim hızı Filiz bandında takip edilebiliyor mu</w:t>
+      </w:r>
+    </w:p>
+    <w:p>
+      <w:pPr>
+        <w:pStyle w:val="ListBullet"/>
+      </w:pPr>
+      <w:r>
+        <w:rPr>
+          <w:color w:val="3A2A1E"/>
+        </w:rPr>
+        <w:t>Yapboz'da Meşe'nin on altı parçası bir turu fazla uzatıyor mu</w:t>
+      </w:r>
+    </w:p>
+    <w:p>
+      <w:pPr>
+        <w:pStyle w:val="ListBullet"/>
+      </w:pPr>
+      <w:r>
+        <w:rPr>
+          <w:color w:val="3A2A1E"/>
+        </w:rPr>
         <w:t>İkon başlatıcıda nasıl duruyor (uyarlanabilir maske yüzü kırpıyor mu)</w:t>
       </w:r>
     </w:p>
@@ -2824,7 +2989,7 @@
         <w:rPr>
           <w:color w:val="3A2A1E"/>
         </w:rPr>
-        <w:t>Sonrası 4. bölümdeki öncelik sırası; içerik yol haritası 5. bölümde.</w:t>
+        <w:t>Sürümü bloke edenler 4. bölümde, içerik yol haritası 5. bölümde.</w:t>
       </w:r>
     </w:p>
     <w:p>

</xml_diff>

<commit_message>
versionCode'u 2'ye çıkar: ilk paket internal testing'e gidiyor
1 kullanılmayacak. O numarayı taşıyan paketler minSdk 21 ile üretilmişti;
numaranın aralıksız artması gerekmiyor, yalnızca büyümesi. 1'i boş
bırakmak, elde kalan eski bir .aab'nin yanlışlıkla yüklenmesini imkânsız
kılıyor — ve Play'e bir kez yüklenen numara, o paket silinse bile geri
alınamıyor.

ApplicationDisplayVersion 1.0'da kalıyor: kullanıcının gördüğü sürüm bu ve
internal testing bir yayın değil.

Mağaza belgesine de girdi: kontrol listesine "ilk yükleme internal testing
kanalına" maddesi eklendi, çünkü uygulama henüz gerçek bir tablette hiç
oynanmadı ve production'a giden bir versionCode geri alınamıyor.

Co-Authored-By: Claude Opus 5 <noreply@anthropic.com>
Claude-Session: https://claude.ai/code/session_01RSxGr5raTKeua4SQiSPP3M
</commit_message>
<xml_diff>
--- a/ilerleme notu.docx
+++ b/ilerleme notu.docx
@@ -3252,7 +3252,7 @@
         <w:rPr>
           <w:color w:val="3A2A1E"/>
         </w:rPr>
-        <w:t xml:space="preserve">Yeni sınırla imzalı paket yeniden üretildi ve doğrulandı: </w:t>
+        <w:t xml:space="preserve">Yeni sınırla imzalı paket üretildi ve manifesti </w:t>
       </w:r>
       <w:r>
         <w:rPr>
@@ -3260,13 +3260,27 @@
           <w:color w:val="3A2A1E"/>
           <w:sz w:val="20"/>
         </w:rPr>
+        <w:t>aapt2 dump badging</w:t>
+      </w:r>
+      <w:r>
+        <w:rPr>
+          <w:color w:val="3A2A1E"/>
+        </w:rPr>
+        <w:t xml:space="preserve"> ile doğrulandı: </w:t>
+      </w:r>
+      <w:r>
+        <w:rPr>
+          <w:rFonts w:ascii="Consolas" w:hAnsi="Consolas"/>
+          <w:color w:val="3A2A1E"/>
+          <w:sz w:val="20"/>
+        </w:rPr>
         <w:t>io.ploofy.app</w:t>
       </w:r>
       <w:r>
         <w:rPr>
           <w:color w:val="3A2A1E"/>
         </w:rPr>
-        <w:t xml:space="preserve">, versionCode 1, versionName 1.0, minSdk 26, targetSdk 36, yatay kilit, </w:t>
+        <w:t xml:space="preserve">, versionName 1.0, minSdk 26, targetSdk 36, yatay kilit, </w:t>
       </w:r>
       <w:r>
         <w:rPr>
@@ -3289,6 +3303,20 @@
           <w:sz w:val="20"/>
         </w:rPr>
         <w:t>x86_64</w:t>
+      </w:r>
+      <w:r>
+        <w:rPr>
+          <w:color w:val="3A2A1E"/>
+        </w:rPr>
+        <w:t xml:space="preserve">, imza </w:t>
+      </w:r>
+      <w:r>
+        <w:rPr>
+          <w:rFonts w:ascii="Consolas" w:hAnsi="Consolas"/>
+          <w:color w:val="3A2A1E"/>
+          <w:sz w:val="20"/>
+        </w:rPr>
+        <w:t>CN=Ali Kiratli, O=Ploofy</w:t>
       </w:r>
       <w:r>
         <w:rPr>
@@ -3302,6 +3330,103 @@
         <w:pStyle w:val="Heading3"/>
       </w:pPr>
       <w:r>
+        <w:t>versionCode 2</w:t>
+      </w:r>
+    </w:p>
+    <w:p>
+      <w:pPr/>
+      <w:r>
+        <w:rPr>
+          <w:color w:val="3A2A1E"/>
+        </w:rPr>
+        <w:t xml:space="preserve">O paket versionCode </w:t>
+      </w:r>
+      <w:r>
+        <w:rPr>
+          <w:b/>
+          <w:color w:val="3A2A1E"/>
+        </w:rPr>
+        <w:t>1</w:t>
+      </w:r>
+      <w:r>
+        <w:rPr>
+          <w:color w:val="3A2A1E"/>
+        </w:rPr>
+        <w:t xml:space="preserve"> taşıyordu ve o numara kullanılmayacak; internal testing'e gidecek paket için </w:t>
+      </w:r>
+      <w:r>
+        <w:rPr>
+          <w:rFonts w:ascii="Consolas" w:hAnsi="Consolas"/>
+          <w:color w:val="3A2A1E"/>
+          <w:sz w:val="20"/>
+        </w:rPr>
+        <w:t>ApplicationVersion</w:t>
+      </w:r>
+      <w:r>
+        <w:rPr>
+          <w:color w:val="3A2A1E"/>
+        </w:rPr>
+        <w:t xml:space="preserve"> </w:t>
+      </w:r>
+      <w:r>
+        <w:rPr>
+          <w:b/>
+          <w:color w:val="3A2A1E"/>
+        </w:rPr>
+        <w:t>2</w:t>
+      </w:r>
+      <w:r>
+        <w:rPr>
+          <w:color w:val="3A2A1E"/>
+        </w:rPr>
+        <w:t>'ye çıkarıldı.</w:t>
+      </w:r>
+    </w:p>
+    <w:p>
+      <w:pPr/>
+      <w:r>
+        <w:rPr>
+          <w:color w:val="3A2A1E"/>
+        </w:rPr>
+        <w:t xml:space="preserve">Sebep: 1'i taşıyan ilk paketler minSdk 21 ile üretilmişti. Numaranın aralıksız artması gerekmiyor, yalnızca büyümesi — 1'i boş bırakmak, elde kalan eski bir </w:t>
+      </w:r>
+      <w:r>
+        <w:rPr>
+          <w:rFonts w:ascii="Consolas" w:hAnsi="Consolas"/>
+          <w:color w:val="3A2A1E"/>
+          <w:sz w:val="20"/>
+        </w:rPr>
+        <w:t>.aab</w:t>
+      </w:r>
+      <w:r>
+        <w:rPr>
+          <w:color w:val="3A2A1E"/>
+        </w:rPr>
+        <w:t>'nin yanlışlıkla yüklenmesini imkânsız kılıyor. Play'e bir kez yüklenen numara, o paket silinse bile geri alınamıyor.</w:t>
+      </w:r>
+    </w:p>
+    <w:p>
+      <w:pPr/>
+      <w:r>
+        <w:rPr>
+          <w:rFonts w:ascii="Consolas" w:hAnsi="Consolas"/>
+          <w:color w:val="3A2A1E"/>
+          <w:sz w:val="20"/>
+        </w:rPr>
+        <w:t>ApplicationDisplayVersion</w:t>
+      </w:r>
+      <w:r>
+        <w:rPr>
+          <w:color w:val="3A2A1E"/>
+        </w:rPr>
+        <w:t xml:space="preserve"> 1.0'da kalıyor: kullanıcının gördüğü sürüm bu ve internal testing bir yayın değil.</w:t>
+      </w:r>
+    </w:p>
+    <w:p>
+      <w:pPr>
+        <w:pStyle w:val="Heading3"/>
+      </w:pPr>
+      <w:r>
         <w:t>Gizlilik politikası</w:t>
       </w:r>
     </w:p>
@@ -4775,13 +4900,35 @@
           <w:color w:val="3A2A1E"/>
           <w:sz w:val="20"/>
         </w:rPr>
-        <w:t>1</w:t>
+        <w:t>2</w:t>
       </w:r>
       <w:r>
         <w:rPr>
           <w:color w:val="3A2A1E"/>
         </w:rPr>
         <w:t xml:space="preserve"> — Play'e her yüklemede versionCode'un artması gerekiyor.</w:t>
+      </w:r>
+    </w:p>
+    <w:p>
+      <w:pPr/>
+      <w:r>
+        <w:rPr>
+          <w:color w:val="3A2A1E"/>
+        </w:rPr>
+        <w:t xml:space="preserve">İlk yükleme </w:t>
+      </w:r>
+      <w:r>
+        <w:rPr>
+          <w:b/>
+          <w:color w:val="3A2A1E"/>
+        </w:rPr>
+        <w:t>internal testing</w:t>
+      </w:r>
+      <w:r>
+        <w:rPr>
+          <w:color w:val="3A2A1E"/>
+        </w:rPr>
+        <w:t xml:space="preserve"> kanalına yapılacak, production'a değil: uygulama henüz gerçek bir tablette hiç oynanmadı ve production'a giden bir versionCode geri alınamıyor.</w:t>
       </w:r>
     </w:p>
     <w:p>

</xml_diff>

<commit_message>
Paketi versionCode 2 ile üret ve doğrula
versionCode 1'i taşıyan paketler silindi, yenileri üretildi ve manifest
aapt2 ile, imza apksigner ile doğrulandı: io.ploofy.app, versionCode 2,
versionName 1.0, minSdk 26, targetSdk 36, yatay kilit, arm64-v8a +
x86_64, imza CN=Ali Kiratli/O=Ploofy — SHA-256 f7549556…4d27, yani önceki
paketlerle aynı anahtar.

Notta yüklenecek dosya da yazılı: io.ploofy.app-Signed.aab. Aynı
klasördeki io.ploofy.app.aab imzasız ve Play onu kabul etmiyor; .apk
yalnızca tablete USB'den kurmak için.

Co-Authored-By: Claude Opus 5 <noreply@anthropic.com>
Claude-Session: https://claude.ai/code/session_01RSxGr5raTKeua4SQiSPP3M
</commit_message>
<xml_diff>
--- a/ilerleme notu.docx
+++ b/ilerleme notu.docx
@@ -3420,6 +3420,175 @@
           <w:color w:val="3A2A1E"/>
         </w:rPr>
         <w:t xml:space="preserve"> 1.0'da kalıyor: kullanıcının gördüğü sürüm bu ve internal testing bir yayın değil.</w:t>
+      </w:r>
+    </w:p>
+    <w:p>
+      <w:pPr/>
+      <w:r>
+        <w:rPr>
+          <w:color w:val="3A2A1E"/>
+        </w:rPr>
+        <w:t xml:space="preserve">versionCode 1'i taşıyan paketler </w:t>
+      </w:r>
+      <w:r>
+        <w:rPr>
+          <w:b/>
+          <w:color w:val="3A2A1E"/>
+        </w:rPr>
+        <w:t>silindi</w:t>
+      </w:r>
+      <w:r>
+        <w:rPr>
+          <w:color w:val="3A2A1E"/>
+        </w:rPr>
+        <w:t xml:space="preserve"> ve paket yeni numarayla yeniden üretilip doğrulandı: </w:t>
+      </w:r>
+      <w:r>
+        <w:rPr>
+          <w:rFonts w:ascii="Consolas" w:hAnsi="Consolas"/>
+          <w:color w:val="3A2A1E"/>
+          <w:sz w:val="20"/>
+        </w:rPr>
+        <w:t>io.ploofy.app</w:t>
+      </w:r>
+      <w:r>
+        <w:rPr>
+          <w:color w:val="3A2A1E"/>
+        </w:rPr>
+        <w:t xml:space="preserve">, versionCode </w:t>
+      </w:r>
+      <w:r>
+        <w:rPr>
+          <w:b/>
+          <w:color w:val="3A2A1E"/>
+        </w:rPr>
+        <w:t>2</w:t>
+      </w:r>
+      <w:r>
+        <w:rPr>
+          <w:color w:val="3A2A1E"/>
+        </w:rPr>
+        <w:t xml:space="preserve">, versionName 1.0, minSdk 26, targetSdk 36, yatay kilit, </w:t>
+      </w:r>
+      <w:r>
+        <w:rPr>
+          <w:rFonts w:ascii="Consolas" w:hAnsi="Consolas"/>
+          <w:color w:val="3A2A1E"/>
+          <w:sz w:val="20"/>
+        </w:rPr>
+        <w:t>arm64-v8a</w:t>
+      </w:r>
+      <w:r>
+        <w:rPr>
+          <w:color w:val="3A2A1E"/>
+        </w:rPr>
+        <w:t xml:space="preserve"> + </w:t>
+      </w:r>
+      <w:r>
+        <w:rPr>
+          <w:rFonts w:ascii="Consolas" w:hAnsi="Consolas"/>
+          <w:color w:val="3A2A1E"/>
+          <w:sz w:val="20"/>
+        </w:rPr>
+        <w:t>x86_64</w:t>
+      </w:r>
+      <w:r>
+        <w:rPr>
+          <w:color w:val="3A2A1E"/>
+        </w:rPr>
+        <w:t xml:space="preserve">, imza </w:t>
+      </w:r>
+      <w:r>
+        <w:rPr>
+          <w:rFonts w:ascii="Consolas" w:hAnsi="Consolas"/>
+          <w:color w:val="3A2A1E"/>
+          <w:sz w:val="20"/>
+        </w:rPr>
+        <w:t>CN=Ali Kiratli, O=Ploofy</w:t>
+      </w:r>
+      <w:r>
+        <w:rPr>
+          <w:color w:val="3A2A1E"/>
+        </w:rPr>
+        <w:t xml:space="preserve"> (SHA-256 </w:t>
+      </w:r>
+      <w:r>
+        <w:rPr>
+          <w:rFonts w:ascii="Consolas" w:hAnsi="Consolas"/>
+          <w:color w:val="3A2A1E"/>
+          <w:sz w:val="20"/>
+        </w:rPr>
+        <w:t>f7549556…4d27</w:t>
+      </w:r>
+      <w:r>
+        <w:rPr>
+          <w:color w:val="3A2A1E"/>
+        </w:rPr>
+        <w:t>, önceki paketlerle aynı anahtar). Boyut 38 MB.</w:t>
+      </w:r>
+    </w:p>
+    <w:p>
+      <w:pPr/>
+      <w:r>
+        <w:rPr>
+          <w:color w:val="3A2A1E"/>
+        </w:rPr>
+        <w:t xml:space="preserve">Yüklenecek dosya </w:t>
+      </w:r>
+      <w:r>
+        <w:rPr>
+          <w:rFonts w:ascii="Consolas" w:hAnsi="Consolas"/>
+          <w:color w:val="3A2A1E"/>
+          <w:sz w:val="20"/>
+        </w:rPr>
+        <w:t>io.ploofy.app-Signed.aab</w:t>
+      </w:r>
+      <w:r>
+        <w:rPr>
+          <w:color w:val="3A2A1E"/>
+        </w:rPr>
+        <w:t xml:space="preserve">. Aynı klasördeki </w:t>
+      </w:r>
+      <w:r>
+        <w:rPr>
+          <w:rFonts w:ascii="Consolas" w:hAnsi="Consolas"/>
+          <w:color w:val="3A2A1E"/>
+          <w:sz w:val="20"/>
+        </w:rPr>
+        <w:t>io.ploofy.app.aab</w:t>
+      </w:r>
+      <w:r>
+        <w:rPr>
+          <w:color w:val="3A2A1E"/>
+        </w:rPr>
+        <w:t xml:space="preserve"> </w:t>
+      </w:r>
+      <w:r>
+        <w:rPr>
+          <w:b/>
+          <w:color w:val="3A2A1E"/>
+        </w:rPr>
+        <w:t>imzasız</w:t>
+      </w:r>
+      <w:r>
+        <w:rPr>
+          <w:color w:val="3A2A1E"/>
+        </w:rPr>
+        <w:t xml:space="preserve"> — Play onu kabul etmiyor. </w:t>
+      </w:r>
+      <w:r>
+        <w:rPr>
+          <w:rFonts w:ascii="Consolas" w:hAnsi="Consolas"/>
+          <w:color w:val="3A2A1E"/>
+          <w:sz w:val="20"/>
+        </w:rPr>
+        <w:t>.apk</w:t>
+      </w:r>
+      <w:r>
+        <w:rPr>
+          <w:color w:val="3A2A1E"/>
+        </w:rPr>
+        <w:t xml:space="preserve"> yalnızca tablete USB'den kurmak için; Play yeni uygulamalarda APK almıyor.</w:t>
       </w:r>
     </w:p>
     <w:p>

</xml_diff>

<commit_message>
Paketi İ8 ile yeniden üret ve doğrula
versionCode 1, versionName 1.0, minSdk 26, targetSdk 36, arm64-v8a +
x86_64, imza CN=Ali Kiratli (SHA-256 f7549556…4d27 — 03.09'daki paketle
aynı sertifika). Manifest aapt2 dump badging, imza apksigner verify ile
kontrol edildi; AAB'nin imzalı olduğu META-INF/PLOOFY.RSA ile ayrıca
doğrulandı. Paketin bu oturumun kodunu taşıdığı, içindeki derlemede
AdaptiveDifficulty ve GameStretchedBadge aranarak görüldü.

Co-Authored-By: Claude Opus 5 <noreply@anthropic.com>
Claude-Session: https://claude.ai/code/session_016FsjX85tbeZdViMHKq6APy
</commit_message>
<xml_diff>
--- a/ilerleme notu.docx
+++ b/ilerleme notu.docx
@@ -5049,7 +5049,7 @@
         <w:pStyle w:val="Heading3"/>
       </w:pPr>
       <w:r>
-        <w:t>Yarın ilk iş: paketi YENİDEN üret ve Play'e yükle</w:t>
+        <w:t>Yarın ilk iş: paketi Play'e yükle</w:t>
       </w:r>
     </w:p>
     <w:p>
@@ -5108,13 +5108,13 @@
           <w:b/>
           <w:color w:val="3A2A1E"/>
         </w:rPr>
-        <w:t>Elde duran paket bayat.</w:t>
-      </w:r>
-      <w:r>
-        <w:rPr>
-          <w:color w:val="3A2A1E"/>
-        </w:rPr>
-        <w:t xml:space="preserve"> 03.09.2026 23:41'de üretilen ve doğrulanan AAB (</w:t>
+        <w:t>Paket İ8 ile yeniden üretildi ve doğrulandı</w:t>
+      </w:r>
+      <w:r>
+        <w:rPr>
+          <w:color w:val="3A2A1E"/>
+        </w:rPr>
+        <w:t xml:space="preserve"> (07.09.2026 08:21): </w:t>
       </w:r>
       <w:r>
         <w:rPr>
@@ -5169,6 +5169,48 @@
         <w:rPr>
           <w:color w:val="3A2A1E"/>
         </w:rPr>
+        <w:t xml:space="preserve">, yatay kilit yerinde, imza </w:t>
+      </w:r>
+      <w:r>
+        <w:rPr>
+          <w:rFonts w:ascii="Consolas" w:hAnsi="Consolas"/>
+          <w:color w:val="3A2A1E"/>
+          <w:sz w:val="20"/>
+        </w:rPr>
+        <w:t>CN=Ali Kiratli, O=Ploofy</w:t>
+      </w:r>
+      <w:r>
+        <w:rPr>
+          <w:color w:val="3A2A1E"/>
+        </w:rPr>
+        <w:t xml:space="preserve"> (SHA-256 </w:t>
+      </w:r>
+      <w:r>
+        <w:rPr>
+          <w:rFonts w:ascii="Consolas" w:hAnsi="Consolas"/>
+          <w:color w:val="3A2A1E"/>
+          <w:sz w:val="20"/>
+        </w:rPr>
+        <w:t>f7549556…4d27</w:t>
+      </w:r>
+      <w:r>
+        <w:rPr>
+          <w:color w:val="3A2A1E"/>
+        </w:rPr>
+        <w:t xml:space="preserve"> — 03.09'daki paketle aynı sertifika). Manifest </w:t>
+      </w:r>
+      <w:r>
+        <w:rPr>
+          <w:rFonts w:ascii="Consolas" w:hAnsi="Consolas"/>
+          <w:color w:val="3A2A1E"/>
+          <w:sz w:val="20"/>
+        </w:rPr>
+        <w:t>aapt2 dump badging</w:t>
+      </w:r>
+      <w:r>
+        <w:rPr>
+          <w:color w:val="3A2A1E"/>
+        </w:rPr>
         <w:t xml:space="preserve">, imza </w:t>
       </w:r>
       <w:r>
@@ -5177,13 +5219,13 @@
           <w:color w:val="3A2A1E"/>
           <w:sz w:val="20"/>
         </w:rPr>
-        <w:t>CN=Ali Kiratli, O=Ploofy</w:t>
-      </w:r>
-      <w:r>
-        <w:rPr>
-          <w:color w:val="3A2A1E"/>
-        </w:rPr>
-        <w:t xml:space="preserve">, SHA-256 </w:t>
+        <w:t>apksigner verify --print-certs</w:t>
+      </w:r>
+      <w:r>
+        <w:rPr>
+          <w:color w:val="3A2A1E"/>
+        </w:rPr>
+        <w:t xml:space="preserve"> ile kontrol edildi; AAB'nin imzalı olduğu </w:t>
       </w:r>
       <w:r>
         <w:rPr>
@@ -5191,26 +5233,111 @@
           <w:color w:val="3A2A1E"/>
           <w:sz w:val="20"/>
         </w:rPr>
-        <w:t>f7549556…4d27</w:t>
-      </w:r>
-      <w:r>
-        <w:rPr>
-          <w:color w:val="3A2A1E"/>
-        </w:rPr>
-        <w:t xml:space="preserve">) İ8'i </w:t>
+        <w:t>META-INF/PLOOFY.RSA</w:t>
+      </w:r>
+      <w:r>
+        <w:rPr>
+          <w:color w:val="3A2A1E"/>
+        </w:rPr>
+        <w:t xml:space="preserve"> ile ayrıca doğrulandı (yanındaki imzasız </w:t>
+      </w:r>
+      <w:r>
+        <w:rPr>
+          <w:rFonts w:ascii="Consolas" w:hAnsi="Consolas"/>
+          <w:color w:val="3A2A1E"/>
+          <w:sz w:val="20"/>
+        </w:rPr>
+        <w:t>io.ploofy.app.aab</w:t>
+      </w:r>
+      <w:r>
+        <w:rPr>
+          <w:color w:val="3A2A1E"/>
+        </w:rPr>
+        <w:t xml:space="preserve"> dosyasında o yok). İçeriğin gerçekten bu oturumun kodu olduğu, paketin içindeki derlemede </w:t>
+      </w:r>
+      <w:r>
+        <w:rPr>
+          <w:rFonts w:ascii="Consolas" w:hAnsi="Consolas"/>
+          <w:color w:val="3A2A1E"/>
+          <w:sz w:val="20"/>
+        </w:rPr>
+        <w:t>AdaptiveDifficulty</w:t>
+      </w:r>
+      <w:r>
+        <w:rPr>
+          <w:color w:val="3A2A1E"/>
+        </w:rPr>
+        <w:t xml:space="preserve"> ve </w:t>
+      </w:r>
+      <w:r>
+        <w:rPr>
+          <w:rFonts w:ascii="Consolas" w:hAnsi="Consolas"/>
+          <w:color w:val="3A2A1E"/>
+          <w:sz w:val="20"/>
+        </w:rPr>
+        <w:t>GameStretchedBadge</w:t>
+      </w:r>
+      <w:r>
+        <w:rPr>
+          <w:color w:val="3A2A1E"/>
+        </w:rPr>
+        <w:t xml:space="preserve"> aranarak görüldü.</w:t>
+      </w:r>
+    </w:p>
+    <w:p>
+      <w:pPr/>
+      <w:r>
+        <w:rPr>
+          <w:color w:val="3A2A1E"/>
+        </w:rPr>
+        <w:t xml:space="preserve">versionCode </w:t>
+      </w:r>
+      <w:r>
+        <w:rPr>
+          <w:rFonts w:ascii="Consolas" w:hAnsi="Consolas"/>
+          <w:color w:val="3A2A1E"/>
+          <w:sz w:val="20"/>
+        </w:rPr>
+        <w:t>1</w:t>
+      </w:r>
+      <w:r>
+        <w:rPr>
+          <w:color w:val="3A2A1E"/>
+        </w:rPr>
+        <w:t xml:space="preserve"> kalıyor: henüz hiçbir şey yüklenmedi. </w:t>
       </w:r>
       <w:r>
         <w:rPr>
           <w:b/>
           <w:color w:val="3A2A1E"/>
         </w:rPr>
-        <w:t>içermiyor</w:t>
-      </w:r>
-      <w:r>
-        <w:rPr>
-          <w:color w:val="3A2A1E"/>
-        </w:rPr>
-        <w:t xml:space="preserve">. Notun kendi kuralı: içerik koda bağlı, notta yazılana değil. Yükleme öncesi yeniden üretilecek ve </w:t>
+        <w:t>Koda bir daha dokunulursa paket yine yeniden üretilecek</w:t>
+      </w:r>
+      <w:r>
+        <w:rPr>
+          <w:color w:val="3A2A1E"/>
+        </w:rPr>
+        <w:t xml:space="preserve"> — içerik koda bağlı, notta yazılana değil.</w:t>
+      </w:r>
+    </w:p>
+    <w:p>
+      <w:pPr/>
+      <w:r>
+        <w:rPr>
+          <w:color w:val="3A2A1E"/>
+        </w:rPr>
+        <w:t>Sıra:</w:t>
+      </w:r>
+    </w:p>
+    <w:p>
+      <w:pPr>
+        <w:pStyle w:val="ListNumber"/>
+      </w:pPr>
+      <w:r>
+        <w:rPr>
+          <w:color w:val="3A2A1E"/>
+        </w:rPr>
+        <w:t xml:space="preserve">Yüklenecek dosya: </w:t>
       </w:r>
       <w:r>
         <w:rPr>
@@ -5218,13 +5345,13 @@
           <w:color w:val="3A2A1E"/>
           <w:sz w:val="20"/>
         </w:rPr>
-        <w:t>aapt2 dump badging</w:t>
-      </w:r>
-      <w:r>
-        <w:rPr>
-          <w:color w:val="3A2A1E"/>
-        </w:rPr>
-        <w:t xml:space="preserve"> + </w:t>
+        <w:t>src/Ploofy.App/bin/Release/net10.0-android/publish/io.ploofy.app-Signed.aab</w:t>
+      </w:r>
+      <w:r>
+        <w:rPr>
+          <w:color w:val="3A2A1E"/>
+        </w:rPr>
+        <w:t xml:space="preserve"> — aynı klasördeki </w:t>
       </w:r>
       <w:r>
         <w:rPr>
@@ -5232,13 +5359,26 @@
           <w:color w:val="3A2A1E"/>
           <w:sz w:val="20"/>
         </w:rPr>
-        <w:t>apksigner verify</w:t>
-      </w:r>
-      <w:r>
-        <w:rPr>
-          <w:color w:val="3A2A1E"/>
-        </w:rPr>
-        <w:t xml:space="preserve"> ile yine kontrol edilecek; versionCode </w:t>
+        <w:t>io.ploofy.app.aab</w:t>
+      </w:r>
+      <w:r>
+        <w:rPr>
+          <w:color w:val="3A2A1E"/>
+        </w:rPr>
+        <w:t xml:space="preserve"> </w:t>
+      </w:r>
+      <w:r>
+        <w:rPr>
+          <w:b/>
+          <w:color w:val="3A2A1E"/>
+        </w:rPr>
+        <w:t>imzasız</w:t>
+      </w:r>
+      <w:r>
+        <w:rPr>
+          <w:color w:val="3A2A1E"/>
+        </w:rPr>
+        <w:t xml:space="preserve">, Play kabul etmiyor. </w:t>
       </w:r>
       <w:r>
         <w:rPr>
@@ -5246,22 +5386,13 @@
           <w:color w:val="3A2A1E"/>
           <w:sz w:val="20"/>
         </w:rPr>
-        <w:t>1</w:t>
-      </w:r>
-      <w:r>
-        <w:rPr>
-          <w:color w:val="3A2A1E"/>
-        </w:rPr>
-        <w:t xml:space="preserve"> kalıyor, çünkü henüz hiçbir şey yüklenmedi.</w:t>
-      </w:r>
-    </w:p>
-    <w:p>
-      <w:pPr/>
-      <w:r>
-        <w:rPr>
-          <w:color w:val="3A2A1E"/>
-        </w:rPr>
-        <w:t>Sıra:</w:t>
+        <w:t>.apk</w:t>
+      </w:r>
+      <w:r>
+        <w:rPr>
+          <w:color w:val="3A2A1E"/>
+        </w:rPr>
+        <w:t xml:space="preserve"> yalnızca tablete USB'den kurmak için</w:t>
       </w:r>
     </w:p>
     <w:p>
@@ -5272,7 +5403,7 @@
         <w:rPr>
           <w:color w:val="3A2A1E"/>
         </w:rPr>
-        <w:t xml:space="preserve">Yüklenecek dosya: </w:t>
+        <w:t xml:space="preserve">Console'daki metinler </w:t>
       </w:r>
       <w:r>
         <w:rPr>
@@ -5280,72 +5411,6 @@
           <w:color w:val="3A2A1E"/>
           <w:sz w:val="20"/>
         </w:rPr>
-        <w:t>src/Ploofy.App/bin/Release/net10.0-android/publish/io.ploofy.app-Signed.aab</w:t>
-      </w:r>
-      <w:r>
-        <w:rPr>
-          <w:color w:val="3A2A1E"/>
-        </w:rPr>
-        <w:t xml:space="preserve"> — aynı klasördeki </w:t>
-      </w:r>
-      <w:r>
-        <w:rPr>
-          <w:rFonts w:ascii="Consolas" w:hAnsi="Consolas"/>
-          <w:color w:val="3A2A1E"/>
-          <w:sz w:val="20"/>
-        </w:rPr>
-        <w:t>io.ploofy.app.aab</w:t>
-      </w:r>
-      <w:r>
-        <w:rPr>
-          <w:color w:val="3A2A1E"/>
-        </w:rPr>
-        <w:t xml:space="preserve"> </w:t>
-      </w:r>
-      <w:r>
-        <w:rPr>
-          <w:b/>
-          <w:color w:val="3A2A1E"/>
-        </w:rPr>
-        <w:t>imzasız</w:t>
-      </w:r>
-      <w:r>
-        <w:rPr>
-          <w:color w:val="3A2A1E"/>
-        </w:rPr>
-        <w:t xml:space="preserve">, Play kabul etmiyor. </w:t>
-      </w:r>
-      <w:r>
-        <w:rPr>
-          <w:rFonts w:ascii="Consolas" w:hAnsi="Consolas"/>
-          <w:color w:val="3A2A1E"/>
-          <w:sz w:val="20"/>
-        </w:rPr>
-        <w:t>.apk</w:t>
-      </w:r>
-      <w:r>
-        <w:rPr>
-          <w:color w:val="3A2A1E"/>
-        </w:rPr>
-        <w:t xml:space="preserve"> yalnızca tablete USB'den kurmak için</w:t>
-      </w:r>
-    </w:p>
-    <w:p>
-      <w:pPr>
-        <w:pStyle w:val="ListNumber"/>
-      </w:pPr>
-      <w:r>
-        <w:rPr>
-          <w:color w:val="3A2A1E"/>
-        </w:rPr>
-        <w:t xml:space="preserve">Console'daki metinler </w:t>
-      </w:r>
-      <w:r>
-        <w:rPr>
-          <w:rFonts w:ascii="Consolas" w:hAnsi="Consolas"/>
-          <w:color w:val="3A2A1E"/>
-          <w:sz w:val="20"/>
-        </w:rPr>
         <w:t>docs/store/listing.md</w:t>
       </w:r>
       <w:r>
@@ -5353,30 +5418,6 @@
           <w:color w:val="3A2A1E"/>
         </w:rPr>
         <w:t xml:space="preserve"> içinden kopyalanacak (üç dil, Data safety cevapları, IARC anketi, hedef kitle beyanı)</w:t>
-      </w:r>
-    </w:p>
-    <w:p>
-      <w:pPr>
-        <w:pStyle w:val="ListNumber"/>
-      </w:pPr>
-      <w:r>
-        <w:rPr>
-          <w:color w:val="3A2A1E"/>
-        </w:rPr>
-        <w:t xml:space="preserve">Koda dokunulduysa paketi </w:t>
-      </w:r>
-      <w:r>
-        <w:rPr>
-          <w:b/>
-          <w:color w:val="3A2A1E"/>
-        </w:rPr>
-        <w:t>yeniden üret</w:t>
-      </w:r>
-      <w:r>
-        <w:rPr>
-          <w:color w:val="3A2A1E"/>
-        </w:rPr>
-        <w:t>: içeriği koda bağlı, notta yazılana değil</w:t>
       </w:r>
     </w:p>
     <w:p>

</xml_diff>